<commit_message>
Fix code-block table widths breaking in Microsoft Word
Code-listing tables used a percentage-based table width with no explicit
cell width, which Word collapses to a near-zero column, wrapping every
character in the code onto its own line. All tables now set matching
explicit widths on both the table and its cells.

Co-Authored-By: Claude Sonnet 5 <noreply@anthropic.com>
Claude-Session: https://claude.ai/code/session_01UtUjwk94rY3yiGt6MTA9Ds
</commit_message>
<xml_diff>
--- a/Secure_Cloud_Tunneling_System_Project_ESUT.docx
+++ b/Secure_Cloud_Tunneling_System_Project_ESUT.docx
@@ -3626,7 +3626,7 @@
           <w:sz w:val="24"/>
           <w:szCs w:val="24"/>
         </w:rPr>
-        <w:t xml:space="preserve">66</w:t>
+        <w:t xml:space="preserve">65</w:t>
       </w:r>
     </w:p>
     <w:p>
@@ -3663,7 +3663,7 @@
           <w:sz w:val="24"/>
           <w:szCs w:val="24"/>
         </w:rPr>
-        <w:t xml:space="preserve">67</w:t>
+        <w:t xml:space="preserve">66</w:t>
       </w:r>
     </w:p>
     <w:p>
@@ -3700,7 +3700,7 @@
           <w:sz w:val="24"/>
           <w:szCs w:val="24"/>
         </w:rPr>
-        <w:t xml:space="preserve">69</w:t>
+        <w:t xml:space="preserve">68</w:t>
       </w:r>
     </w:p>
     <w:p>
@@ -9782,7 +9782,7 @@
     </w:p>
     <w:tbl>
       <w:tblPr>
-        <w:tblW w:type="pct" w:w="100%"/>
+        <w:tblW w:type="dxa" w:w="9350"/>
         <w:tblBorders>
           <w:top w:val="single" w:color="BFBFBF" w:sz="4"/>
           <w:left w:val="single" w:color="BFBFBF" w:sz="4"/>
@@ -9793,11 +9793,12 @@
         </w:tblBorders>
       </w:tblPr>
       <w:tblGrid>
-        <w:gridCol w:w="100"/>
+        <w:gridCol w:w="9350"/>
       </w:tblGrid>
       <w:tr>
         <w:tc>
           <w:tcPr>
+            <w:tcW w:type="dxa" w:w="9350"/>
             <w:shd w:fill="F2F2F2" w:val="clear"/>
             <w:tcMar>
               <w:top w:type="dxa" w:w="120"/>
@@ -10079,7 +10080,7 @@
     </w:p>
     <w:tbl>
       <w:tblPr>
-        <w:tblW w:type="pct" w:w="100%"/>
+        <w:tblW w:type="dxa" w:w="9350"/>
         <w:tblBorders>
           <w:top w:val="single" w:color="BFBFBF" w:sz="4"/>
           <w:left w:val="single" w:color="BFBFBF" w:sz="4"/>
@@ -10090,11 +10091,12 @@
         </w:tblBorders>
       </w:tblPr>
       <w:tblGrid>
-        <w:gridCol w:w="100"/>
+        <w:gridCol w:w="9350"/>
       </w:tblGrid>
       <w:tr>
         <w:tc>
           <w:tcPr>
+            <w:tcW w:type="dxa" w:w="9350"/>
             <w:shd w:fill="F2F2F2" w:val="clear"/>
             <w:tcMar>
               <w:top w:type="dxa" w:w="120"/>
@@ -10324,7 +10326,7 @@
     </w:p>
     <w:tbl>
       <w:tblPr>
-        <w:tblW w:type="pct" w:w="100%"/>
+        <w:tblW w:type="dxa" w:w="9350"/>
         <w:tblBorders>
           <w:top w:val="single" w:color="BFBFBF" w:sz="4"/>
           <w:left w:val="single" w:color="BFBFBF" w:sz="4"/>
@@ -10335,11 +10337,12 @@
         </w:tblBorders>
       </w:tblPr>
       <w:tblGrid>
-        <w:gridCol w:w="100"/>
+        <w:gridCol w:w="9350"/>
       </w:tblGrid>
       <w:tr>
         <w:tc>
           <w:tcPr>
+            <w:tcW w:type="dxa" w:w="9350"/>
             <w:shd w:fill="F2F2F2" w:val="clear"/>
             <w:tcMar>
               <w:top w:type="dxa" w:w="120"/>
@@ -10582,7 +10585,7 @@
     </w:p>
     <w:tbl>
       <w:tblPr>
-        <w:tblW w:type="pct" w:w="100%"/>
+        <w:tblW w:type="dxa" w:w="9350"/>
         <w:tblBorders>
           <w:top w:val="single" w:color="BFBFBF" w:sz="4"/>
           <w:left w:val="single" w:color="BFBFBF" w:sz="4"/>
@@ -10593,11 +10596,12 @@
         </w:tblBorders>
       </w:tblPr>
       <w:tblGrid>
-        <w:gridCol w:w="100"/>
+        <w:gridCol w:w="9350"/>
       </w:tblGrid>
       <w:tr>
         <w:tc>
           <w:tcPr>
+            <w:tcW w:type="dxa" w:w="9350"/>
             <w:shd w:fill="F2F2F2" w:val="clear"/>
             <w:tcMar>
               <w:top w:type="dxa" w:w="120"/>
@@ -10852,7 +10856,7 @@
     </w:p>
     <w:tbl>
       <w:tblPr>
-        <w:tblW w:type="pct" w:w="100%"/>
+        <w:tblW w:type="dxa" w:w="9350"/>
         <w:tblBorders>
           <w:top w:val="single" w:color="BFBFBF" w:sz="4"/>
           <w:left w:val="single" w:color="BFBFBF" w:sz="4"/>
@@ -10863,11 +10867,12 @@
         </w:tblBorders>
       </w:tblPr>
       <w:tblGrid>
-        <w:gridCol w:w="100"/>
+        <w:gridCol w:w="9350"/>
       </w:tblGrid>
       <w:tr>
         <w:tc>
           <w:tcPr>
+            <w:tcW w:type="dxa" w:w="9350"/>
             <w:shd w:fill="F2F2F2" w:val="clear"/>
             <w:tcMar>
               <w:top w:type="dxa" w:w="120"/>
@@ -11123,7 +11128,7 @@
     </w:p>
     <w:tbl>
       <w:tblPr>
-        <w:tblW w:type="pct" w:w="100%"/>
+        <w:tblW w:type="dxa" w:w="9350"/>
         <w:tblBorders>
           <w:top w:val="single" w:color="BFBFBF" w:sz="4"/>
           <w:left w:val="single" w:color="BFBFBF" w:sz="4"/>
@@ -11134,11 +11139,12 @@
         </w:tblBorders>
       </w:tblPr>
       <w:tblGrid>
-        <w:gridCol w:w="100"/>
+        <w:gridCol w:w="9350"/>
       </w:tblGrid>
       <w:tr>
         <w:tc>
           <w:tcPr>
+            <w:tcW w:type="dxa" w:w="9350"/>
             <w:shd w:fill="F2F2F2" w:val="clear"/>
             <w:tcMar>
               <w:top w:type="dxa" w:w="120"/>
@@ -11407,7 +11413,7 @@
     </w:p>
     <w:tbl>
       <w:tblPr>
-        <w:tblW w:type="pct" w:w="100%"/>
+        <w:tblW w:type="dxa" w:w="9350"/>
         <w:tblBorders>
           <w:top w:val="single" w:color="BFBFBF" w:sz="4"/>
           <w:left w:val="single" w:color="BFBFBF" w:sz="4"/>
@@ -11418,11 +11424,12 @@
         </w:tblBorders>
       </w:tblPr>
       <w:tblGrid>
-        <w:gridCol w:w="100"/>
+        <w:gridCol w:w="9350"/>
       </w:tblGrid>
       <w:tr>
         <w:tc>
           <w:tcPr>
+            <w:tcW w:type="dxa" w:w="9350"/>
             <w:shd w:fill="F2F2F2" w:val="clear"/>
             <w:tcMar>
               <w:top w:type="dxa" w:w="120"/>
@@ -11651,7 +11658,7 @@
     </w:p>
     <w:tbl>
       <w:tblPr>
-        <w:tblW w:type="pct" w:w="100%"/>
+        <w:tblW w:type="dxa" w:w="9350"/>
         <w:tblBorders>
           <w:top w:val="single" w:color="BFBFBF" w:sz="4"/>
           <w:left w:val="single" w:color="BFBFBF" w:sz="4"/>
@@ -11662,11 +11669,12 @@
         </w:tblBorders>
       </w:tblPr>
       <w:tblGrid>
-        <w:gridCol w:w="100"/>
+        <w:gridCol w:w="9350"/>
       </w:tblGrid>
       <w:tr>
         <w:tc>
           <w:tcPr>
+            <w:tcW w:type="dxa" w:w="9350"/>
             <w:shd w:fill="F2F2F2" w:val="clear"/>
             <w:tcMar>
               <w:top w:type="dxa" w:w="120"/>
@@ -11896,7 +11904,7 @@
     </w:p>
     <w:tbl>
       <w:tblPr>
-        <w:tblW w:type="pct" w:w="100%"/>
+        <w:tblW w:type="dxa" w:w="9350"/>
         <w:tblBorders>
           <w:top w:val="single" w:color="BFBFBF" w:sz="4"/>
           <w:left w:val="single" w:color="BFBFBF" w:sz="4"/>
@@ -11907,11 +11915,12 @@
         </w:tblBorders>
       </w:tblPr>
       <w:tblGrid>
-        <w:gridCol w:w="100"/>
+        <w:gridCol w:w="9350"/>
       </w:tblGrid>
       <w:tr>
         <w:tc>
           <w:tcPr>
+            <w:tcW w:type="dxa" w:w="9350"/>
             <w:shd w:fill="F2F2F2" w:val="clear"/>
             <w:tcMar>
               <w:top w:type="dxa" w:w="120"/>
@@ -12154,7 +12163,7 @@
     </w:p>
     <w:tbl>
       <w:tblPr>
-        <w:tblW w:type="pct" w:w="100%"/>
+        <w:tblW w:type="dxa" w:w="9350"/>
         <w:tblBorders>
           <w:top w:val="single" w:color="BFBFBF" w:sz="4"/>
           <w:left w:val="single" w:color="BFBFBF" w:sz="4"/>
@@ -12165,11 +12174,12 @@
         </w:tblBorders>
       </w:tblPr>
       <w:tblGrid>
-        <w:gridCol w:w="100"/>
+        <w:gridCol w:w="9350"/>
       </w:tblGrid>
       <w:tr>
         <w:tc>
           <w:tcPr>
+            <w:tcW w:type="dxa" w:w="9350"/>
             <w:shd w:fill="F2F2F2" w:val="clear"/>
             <w:tcMar>
               <w:top w:type="dxa" w:w="120"/>
@@ -12353,7 +12363,7 @@
     </w:p>
     <w:tbl>
       <w:tblPr>
-        <w:tblW w:type="pct" w:w="100%"/>
+        <w:tblW w:type="dxa" w:w="9350"/>
         <w:tblBorders>
           <w:top w:val="single" w:color="BFBFBF" w:sz="4"/>
           <w:left w:val="single" w:color="BFBFBF" w:sz="4"/>
@@ -12364,11 +12374,12 @@
         </w:tblBorders>
       </w:tblPr>
       <w:tblGrid>
-        <w:gridCol w:w="100"/>
+        <w:gridCol w:w="9350"/>
       </w:tblGrid>
       <w:tr>
         <w:tc>
           <w:tcPr>
+            <w:tcW w:type="dxa" w:w="9350"/>
             <w:shd w:fill="F2F2F2" w:val="clear"/>
             <w:tcMar>
               <w:top w:type="dxa" w:w="120"/>
@@ -12558,7 +12569,7 @@
     </w:p>
     <w:tbl>
       <w:tblPr>
-        <w:tblW w:type="pct" w:w="100%"/>
+        <w:tblW w:type="dxa" w:w="9350"/>
         <w:tblBorders>
           <w:top w:val="single" w:color="BFBFBF" w:sz="4"/>
           <w:left w:val="single" w:color="BFBFBF" w:sz="4"/>
@@ -12569,11 +12580,12 @@
         </w:tblBorders>
       </w:tblPr>
       <w:tblGrid>
-        <w:gridCol w:w="100"/>
+        <w:gridCol w:w="9350"/>
       </w:tblGrid>
       <w:tr>
         <w:tc>
           <w:tcPr>
+            <w:tcW w:type="dxa" w:w="9350"/>
             <w:shd w:fill="F2F2F2" w:val="clear"/>
             <w:tcMar>
               <w:top w:type="dxa" w:w="120"/>
@@ -15631,7 +15643,7 @@
     </w:p>
     <w:tbl>
       <w:tblPr>
-        <w:tblW w:type="pct" w:w="100%"/>
+        <w:tblW w:type="dxa" w:w="9350"/>
         <w:tblBorders>
           <w:top w:val="single" w:color="BFBFBF" w:sz="4"/>
           <w:left w:val="single" w:color="BFBFBF" w:sz="4"/>
@@ -15642,11 +15654,12 @@
         </w:tblBorders>
       </w:tblPr>
       <w:tblGrid>
-        <w:gridCol w:w="100"/>
+        <w:gridCol w:w="9350"/>
       </w:tblGrid>
       <w:tr>
         <w:tc>
           <w:tcPr>
+            <w:tcW w:type="dxa" w:w="9350"/>
             <w:shd w:fill="F7F7F7" w:val="clear"/>
             <w:tcMar>
               <w:top w:type="dxa" w:w="100"/>
@@ -15657,7 +15670,7 @@
           </w:tcPr>
           <w:p>
             <w:pPr>
-              <w:spacing w:after="0" w:line="200"/>
+              <w:spacing w:after="0" w:line="200" w:lineRule="auto"/>
             </w:pPr>
             <w:r>
               <w:rPr>
@@ -15670,7 +15683,7 @@
           </w:p>
           <w:p>
             <w:pPr>
-              <w:spacing w:after="0" w:line="200"/>
+              <w:spacing w:after="0" w:line="200" w:lineRule="auto"/>
             </w:pPr>
             <w:r>
               <w:rPr>
@@ -15683,7 +15696,7 @@
           </w:p>
           <w:p>
             <w:pPr>
-              <w:spacing w:after="0" w:line="200"/>
+              <w:spacing w:after="0" w:line="200" w:lineRule="auto"/>
             </w:pPr>
             <w:r>
               <w:rPr>
@@ -15696,7 +15709,7 @@
           </w:p>
           <w:p>
             <w:pPr>
-              <w:spacing w:after="0" w:line="200"/>
+              <w:spacing w:after="0" w:line="200" w:lineRule="auto"/>
             </w:pPr>
             <w:r>
               <w:rPr>
@@ -15732,7 +15745,7 @@
     </w:p>
     <w:tbl>
       <w:tblPr>
-        <w:tblW w:type="pct" w:w="100%"/>
+        <w:tblW w:type="dxa" w:w="9350"/>
         <w:tblBorders>
           <w:top w:val="single" w:color="BFBFBF" w:sz="4"/>
           <w:left w:val="single" w:color="BFBFBF" w:sz="4"/>
@@ -15743,11 +15756,12 @@
         </w:tblBorders>
       </w:tblPr>
       <w:tblGrid>
-        <w:gridCol w:w="100"/>
+        <w:gridCol w:w="9350"/>
       </w:tblGrid>
       <w:tr>
         <w:tc>
           <w:tcPr>
+            <w:tcW w:type="dxa" w:w="9350"/>
             <w:shd w:fill="F7F7F7" w:val="clear"/>
             <w:tcMar>
               <w:top w:type="dxa" w:w="100"/>
@@ -15758,7 +15772,7 @@
           </w:tcPr>
           <w:p>
             <w:pPr>
-              <w:spacing w:after="0" w:line="200"/>
+              <w:spacing w:after="0" w:line="200" w:lineRule="auto"/>
             </w:pPr>
             <w:r>
               <w:rPr>
@@ -15771,7 +15785,7 @@
           </w:p>
           <w:p>
             <w:pPr>
-              <w:spacing w:after="0" w:line="200"/>
+              <w:spacing w:after="0" w:line="200" w:lineRule="auto"/>
             </w:pPr>
             <w:r>
               <w:rPr>
@@ -15784,7 +15798,7 @@
           </w:p>
           <w:p>
             <w:pPr>
-              <w:spacing w:after="0" w:line="200"/>
+              <w:spacing w:after="0" w:line="200" w:lineRule="auto"/>
             </w:pPr>
             <w:r>
               <w:rPr>
@@ -15797,7 +15811,7 @@
           </w:p>
           <w:p>
             <w:pPr>
-              <w:spacing w:after="0" w:line="200"/>
+              <w:spacing w:after="0" w:line="200" w:lineRule="auto"/>
             </w:pPr>
             <w:r>
               <w:rPr>
@@ -15810,7 +15824,7 @@
           </w:p>
           <w:p>
             <w:pPr>
-              <w:spacing w:after="0" w:line="200"/>
+              <w:spacing w:after="0" w:line="200" w:lineRule="auto"/>
             </w:pPr>
             <w:r>
               <w:rPr>
@@ -15823,7 +15837,7 @@
           </w:p>
           <w:p>
             <w:pPr>
-              <w:spacing w:after="0" w:line="200"/>
+              <w:spacing w:after="0" w:line="200" w:lineRule="auto"/>
             </w:pPr>
             <w:r>
               <w:rPr>
@@ -15836,7 +15850,7 @@
           </w:p>
           <w:p>
             <w:pPr>
-              <w:spacing w:after="0" w:line="200"/>
+              <w:spacing w:after="0" w:line="200" w:lineRule="auto"/>
             </w:pPr>
             <w:r>
               <w:rPr>
@@ -15849,7 +15863,7 @@
           </w:p>
           <w:p>
             <w:pPr>
-              <w:spacing w:after="0" w:line="200"/>
+              <w:spacing w:after="0" w:line="200" w:lineRule="auto"/>
             </w:pPr>
             <w:r>
               <w:rPr>
@@ -15862,7 +15876,7 @@
           </w:p>
           <w:p>
             <w:pPr>
-              <w:spacing w:after="0" w:line="200"/>
+              <w:spacing w:after="0" w:line="200" w:lineRule="auto"/>
             </w:pPr>
             <w:r>
               <w:rPr>
@@ -15875,7 +15889,7 @@
           </w:p>
           <w:p>
             <w:pPr>
-              <w:spacing w:after="0" w:line="200"/>
+              <w:spacing w:after="0" w:line="200" w:lineRule="auto"/>
             </w:pPr>
             <w:r>
               <w:rPr>
@@ -15888,7 +15902,7 @@
           </w:p>
           <w:p>
             <w:pPr>
-              <w:spacing w:after="0" w:line="200"/>
+              <w:spacing w:after="0" w:line="200" w:lineRule="auto"/>
             </w:pPr>
             <w:r>
               <w:rPr>
@@ -15901,7 +15915,7 @@
           </w:p>
           <w:p>
             <w:pPr>
-              <w:spacing w:after="0" w:line="200"/>
+              <w:spacing w:after="0" w:line="200" w:lineRule="auto"/>
             </w:pPr>
             <w:r>
               <w:rPr>
@@ -15914,7 +15928,7 @@
           </w:p>
           <w:p>
             <w:pPr>
-              <w:spacing w:after="0" w:line="200"/>
+              <w:spacing w:after="0" w:line="200" w:lineRule="auto"/>
             </w:pPr>
             <w:r>
               <w:rPr>
@@ -15927,7 +15941,7 @@
           </w:p>
           <w:p>
             <w:pPr>
-              <w:spacing w:after="0" w:line="200"/>
+              <w:spacing w:after="0" w:line="200" w:lineRule="auto"/>
             </w:pPr>
             <w:r>
               <w:rPr>
@@ -15940,7 +15954,7 @@
           </w:p>
           <w:p>
             <w:pPr>
-              <w:spacing w:after="0" w:line="200"/>
+              <w:spacing w:after="0" w:line="200" w:lineRule="auto"/>
             </w:pPr>
             <w:r>
               <w:rPr>
@@ -15953,7 +15967,7 @@
           </w:p>
           <w:p>
             <w:pPr>
-              <w:spacing w:after="0" w:line="200"/>
+              <w:spacing w:after="0" w:line="200" w:lineRule="auto"/>
             </w:pPr>
             <w:r>
               <w:rPr>
@@ -15966,7 +15980,7 @@
           </w:p>
           <w:p>
             <w:pPr>
-              <w:spacing w:after="0" w:line="200"/>
+              <w:spacing w:after="0" w:line="200" w:lineRule="auto"/>
             </w:pPr>
             <w:r>
               <w:rPr>
@@ -15979,7 +15993,7 @@
           </w:p>
           <w:p>
             <w:pPr>
-              <w:spacing w:after="0" w:line="200"/>
+              <w:spacing w:after="0" w:line="200" w:lineRule="auto"/>
             </w:pPr>
             <w:r>
               <w:rPr>
@@ -15992,7 +16006,7 @@
           </w:p>
           <w:p>
             <w:pPr>
-              <w:spacing w:after="0" w:line="200"/>
+              <w:spacing w:after="0" w:line="200" w:lineRule="auto"/>
             </w:pPr>
             <w:r>
               <w:rPr>
@@ -16005,7 +16019,7 @@
           </w:p>
           <w:p>
             <w:pPr>
-              <w:spacing w:after="0" w:line="200"/>
+              <w:spacing w:after="0" w:line="200" w:lineRule="auto"/>
             </w:pPr>
             <w:r>
               <w:rPr>
@@ -16018,7 +16032,7 @@
           </w:p>
           <w:p>
             <w:pPr>
-              <w:spacing w:after="0" w:line="200"/>
+              <w:spacing w:after="0" w:line="200" w:lineRule="auto"/>
             </w:pPr>
             <w:r>
               <w:rPr>
@@ -16031,7 +16045,7 @@
           </w:p>
           <w:p>
             <w:pPr>
-              <w:spacing w:after="0" w:line="200"/>
+              <w:spacing w:after="0" w:line="200" w:lineRule="auto"/>
             </w:pPr>
             <w:r>
               <w:rPr>
@@ -16044,7 +16058,7 @@
           </w:p>
           <w:p>
             <w:pPr>
-              <w:spacing w:after="0" w:line="200"/>
+              <w:spacing w:after="0" w:line="200" w:lineRule="auto"/>
             </w:pPr>
             <w:r>
               <w:rPr>
@@ -16057,7 +16071,7 @@
           </w:p>
           <w:p>
             <w:pPr>
-              <w:spacing w:after="0" w:line="200"/>
+              <w:spacing w:after="0" w:line="200" w:lineRule="auto"/>
             </w:pPr>
             <w:r>
               <w:rPr>
@@ -16070,7 +16084,7 @@
           </w:p>
           <w:p>
             <w:pPr>
-              <w:spacing w:after="0" w:line="200"/>
+              <w:spacing w:after="0" w:line="200" w:lineRule="auto"/>
             </w:pPr>
             <w:r>
               <w:rPr>
@@ -16083,7 +16097,7 @@
           </w:p>
           <w:p>
             <w:pPr>
-              <w:spacing w:after="0" w:line="200"/>
+              <w:spacing w:after="0" w:line="200" w:lineRule="auto"/>
             </w:pPr>
             <w:r>
               <w:rPr>
@@ -16096,7 +16110,7 @@
           </w:p>
           <w:p>
             <w:pPr>
-              <w:spacing w:after="0" w:line="200"/>
+              <w:spacing w:after="0" w:line="200" w:lineRule="auto"/>
             </w:pPr>
             <w:r>
               <w:rPr>
@@ -16109,7 +16123,7 @@
           </w:p>
           <w:p>
             <w:pPr>
-              <w:spacing w:after="0" w:line="200"/>
+              <w:spacing w:after="0" w:line="200" w:lineRule="auto"/>
             </w:pPr>
             <w:r>
               <w:rPr>
@@ -16122,7 +16136,7 @@
           </w:p>
           <w:p>
             <w:pPr>
-              <w:spacing w:after="0" w:line="200"/>
+              <w:spacing w:after="0" w:line="200" w:lineRule="auto"/>
             </w:pPr>
             <w:r>
               <w:rPr>
@@ -16135,7 +16149,7 @@
           </w:p>
           <w:p>
             <w:pPr>
-              <w:spacing w:after="0" w:line="200"/>
+              <w:spacing w:after="0" w:line="200" w:lineRule="auto"/>
             </w:pPr>
             <w:r>
               <w:rPr>
@@ -16148,7 +16162,7 @@
           </w:p>
           <w:p>
             <w:pPr>
-              <w:spacing w:after="0" w:line="200"/>
+              <w:spacing w:after="0" w:line="200" w:lineRule="auto"/>
             </w:pPr>
             <w:r>
               <w:rPr>
@@ -16161,7 +16175,7 @@
           </w:p>
           <w:p>
             <w:pPr>
-              <w:spacing w:after="0" w:line="200"/>
+              <w:spacing w:after="0" w:line="200" w:lineRule="auto"/>
             </w:pPr>
             <w:r>
               <w:rPr>
@@ -16174,7 +16188,7 @@
           </w:p>
           <w:p>
             <w:pPr>
-              <w:spacing w:after="0" w:line="200"/>
+              <w:spacing w:after="0" w:line="200" w:lineRule="auto"/>
             </w:pPr>
             <w:r>
               <w:rPr>
@@ -16187,7 +16201,7 @@
           </w:p>
           <w:p>
             <w:pPr>
-              <w:spacing w:after="0" w:line="200"/>
+              <w:spacing w:after="0" w:line="200" w:lineRule="auto"/>
             </w:pPr>
             <w:r>
               <w:rPr>
@@ -16200,7 +16214,7 @@
           </w:p>
           <w:p>
             <w:pPr>
-              <w:spacing w:after="0" w:line="200"/>
+              <w:spacing w:after="0" w:line="200" w:lineRule="auto"/>
             </w:pPr>
             <w:r>
               <w:rPr>
@@ -16213,7 +16227,7 @@
           </w:p>
           <w:p>
             <w:pPr>
-              <w:spacing w:after="0" w:line="200"/>
+              <w:spacing w:after="0" w:line="200" w:lineRule="auto"/>
             </w:pPr>
             <w:r>
               <w:rPr>
@@ -16226,7 +16240,7 @@
           </w:p>
           <w:p>
             <w:pPr>
-              <w:spacing w:after="0" w:line="200"/>
+              <w:spacing w:after="0" w:line="200" w:lineRule="auto"/>
             </w:pPr>
             <w:r>
               <w:rPr>
@@ -16239,7 +16253,7 @@
           </w:p>
           <w:p>
             <w:pPr>
-              <w:spacing w:after="0" w:line="200"/>
+              <w:spacing w:after="0" w:line="200" w:lineRule="auto"/>
             </w:pPr>
             <w:r>
               <w:rPr>
@@ -16252,7 +16266,7 @@
           </w:p>
           <w:p>
             <w:pPr>
-              <w:spacing w:after="0" w:line="200"/>
+              <w:spacing w:after="0" w:line="200" w:lineRule="auto"/>
             </w:pPr>
             <w:r>
               <w:rPr>
@@ -16265,7 +16279,7 @@
           </w:p>
           <w:p>
             <w:pPr>
-              <w:spacing w:after="0" w:line="200"/>
+              <w:spacing w:after="0" w:line="200" w:lineRule="auto"/>
             </w:pPr>
             <w:r>
               <w:rPr>
@@ -16278,7 +16292,7 @@
           </w:p>
           <w:p>
             <w:pPr>
-              <w:spacing w:after="0" w:line="200"/>
+              <w:spacing w:after="0" w:line="200" w:lineRule="auto"/>
             </w:pPr>
             <w:r>
               <w:rPr>
@@ -16291,7 +16305,7 @@
           </w:p>
           <w:p>
             <w:pPr>
-              <w:spacing w:after="0" w:line="200"/>
+              <w:spacing w:after="0" w:line="200" w:lineRule="auto"/>
             </w:pPr>
             <w:r>
               <w:rPr>
@@ -16304,7 +16318,7 @@
           </w:p>
           <w:p>
             <w:pPr>
-              <w:spacing w:after="0" w:line="200"/>
+              <w:spacing w:after="0" w:line="200" w:lineRule="auto"/>
             </w:pPr>
             <w:r>
               <w:rPr>
@@ -16317,7 +16331,7 @@
           </w:p>
           <w:p>
             <w:pPr>
-              <w:spacing w:after="0" w:line="200"/>
+              <w:spacing w:after="0" w:line="200" w:lineRule="auto"/>
             </w:pPr>
             <w:r>
               <w:rPr>
@@ -16330,7 +16344,7 @@
           </w:p>
           <w:p>
             <w:pPr>
-              <w:spacing w:after="0" w:line="200"/>
+              <w:spacing w:after="0" w:line="200" w:lineRule="auto"/>
             </w:pPr>
             <w:r>
               <w:rPr>
@@ -16343,7 +16357,7 @@
           </w:p>
           <w:p>
             <w:pPr>
-              <w:spacing w:after="0" w:line="200"/>
+              <w:spacing w:after="0" w:line="200" w:lineRule="auto"/>
             </w:pPr>
             <w:r>
               <w:rPr>
@@ -16356,7 +16370,7 @@
           </w:p>
           <w:p>
             <w:pPr>
-              <w:spacing w:after="0" w:line="200"/>
+              <w:spacing w:after="0" w:line="200" w:lineRule="auto"/>
             </w:pPr>
             <w:r>
               <w:rPr>
@@ -16369,7 +16383,7 @@
           </w:p>
           <w:p>
             <w:pPr>
-              <w:spacing w:after="0" w:line="200"/>
+              <w:spacing w:after="0" w:line="200" w:lineRule="auto"/>
             </w:pPr>
             <w:r>
               <w:rPr>
@@ -16382,7 +16396,7 @@
           </w:p>
           <w:p>
             <w:pPr>
-              <w:spacing w:after="0" w:line="200"/>
+              <w:spacing w:after="0" w:line="200" w:lineRule="auto"/>
             </w:pPr>
             <w:r>
               <w:rPr>
@@ -16395,7 +16409,7 @@
           </w:p>
           <w:p>
             <w:pPr>
-              <w:spacing w:after="0" w:line="200"/>
+              <w:spacing w:after="0" w:line="200" w:lineRule="auto"/>
             </w:pPr>
             <w:r>
               <w:rPr>
@@ -16408,7 +16422,7 @@
           </w:p>
           <w:p>
             <w:pPr>
-              <w:spacing w:after="0" w:line="200"/>
+              <w:spacing w:after="0" w:line="200" w:lineRule="auto"/>
             </w:pPr>
             <w:r>
               <w:rPr>
@@ -16421,7 +16435,7 @@
           </w:p>
           <w:p>
             <w:pPr>
-              <w:spacing w:after="0" w:line="200"/>
+              <w:spacing w:after="0" w:line="200" w:lineRule="auto"/>
             </w:pPr>
             <w:r>
               <w:rPr>
@@ -16434,7 +16448,7 @@
           </w:p>
           <w:p>
             <w:pPr>
-              <w:spacing w:after="0" w:line="200"/>
+              <w:spacing w:after="0" w:line="200" w:lineRule="auto"/>
             </w:pPr>
             <w:r>
               <w:rPr>
@@ -16447,7 +16461,7 @@
           </w:p>
           <w:p>
             <w:pPr>
-              <w:spacing w:after="0" w:line="200"/>
+              <w:spacing w:after="0" w:line="200" w:lineRule="auto"/>
             </w:pPr>
             <w:r>
               <w:rPr>
@@ -16460,7 +16474,7 @@
           </w:p>
           <w:p>
             <w:pPr>
-              <w:spacing w:after="0" w:line="200"/>
+              <w:spacing w:after="0" w:line="200" w:lineRule="auto"/>
             </w:pPr>
             <w:r>
               <w:rPr>
@@ -16473,7 +16487,7 @@
           </w:p>
           <w:p>
             <w:pPr>
-              <w:spacing w:after="0" w:line="200"/>
+              <w:spacing w:after="0" w:line="200" w:lineRule="auto"/>
             </w:pPr>
             <w:r>
               <w:rPr>
@@ -16486,7 +16500,7 @@
           </w:p>
           <w:p>
             <w:pPr>
-              <w:spacing w:after="0" w:line="200"/>
+              <w:spacing w:after="0" w:line="200" w:lineRule="auto"/>
             </w:pPr>
             <w:r>
               <w:rPr>
@@ -16499,7 +16513,7 @@
           </w:p>
           <w:p>
             <w:pPr>
-              <w:spacing w:after="0" w:line="200"/>
+              <w:spacing w:after="0" w:line="200" w:lineRule="auto"/>
             </w:pPr>
             <w:r>
               <w:rPr>
@@ -16512,7 +16526,7 @@
           </w:p>
           <w:p>
             <w:pPr>
-              <w:spacing w:after="0" w:line="200"/>
+              <w:spacing w:after="0" w:line="200" w:lineRule="auto"/>
             </w:pPr>
             <w:r>
               <w:rPr>
@@ -16525,7 +16539,7 @@
           </w:p>
           <w:p>
             <w:pPr>
-              <w:spacing w:after="0" w:line="200"/>
+              <w:spacing w:after="0" w:line="200" w:lineRule="auto"/>
             </w:pPr>
             <w:r>
               <w:rPr>
@@ -16538,7 +16552,7 @@
           </w:p>
           <w:p>
             <w:pPr>
-              <w:spacing w:after="0" w:line="200"/>
+              <w:spacing w:after="0" w:line="200" w:lineRule="auto"/>
             </w:pPr>
             <w:r>
               <w:rPr>
@@ -16551,7 +16565,7 @@
           </w:p>
           <w:p>
             <w:pPr>
-              <w:spacing w:after="0" w:line="200"/>
+              <w:spacing w:after="0" w:line="200" w:lineRule="auto"/>
             </w:pPr>
             <w:r>
               <w:rPr>
@@ -16564,7 +16578,7 @@
           </w:p>
           <w:p>
             <w:pPr>
-              <w:spacing w:after="0" w:line="200"/>
+              <w:spacing w:after="0" w:line="200" w:lineRule="auto"/>
             </w:pPr>
             <w:r>
               <w:rPr>
@@ -16577,7 +16591,7 @@
           </w:p>
           <w:p>
             <w:pPr>
-              <w:spacing w:after="0" w:line="200"/>
+              <w:spacing w:after="0" w:line="200" w:lineRule="auto"/>
             </w:pPr>
             <w:r>
               <w:rPr>
@@ -16590,7 +16604,7 @@
           </w:p>
           <w:p>
             <w:pPr>
-              <w:spacing w:after="0" w:line="200"/>
+              <w:spacing w:after="0" w:line="200" w:lineRule="auto"/>
             </w:pPr>
             <w:r>
               <w:rPr>
@@ -16603,7 +16617,7 @@
           </w:p>
           <w:p>
             <w:pPr>
-              <w:spacing w:after="0" w:line="200"/>
+              <w:spacing w:after="0" w:line="200" w:lineRule="auto"/>
             </w:pPr>
             <w:r>
               <w:rPr>
@@ -16616,7 +16630,7 @@
           </w:p>
           <w:p>
             <w:pPr>
-              <w:spacing w:after="0" w:line="200"/>
+              <w:spacing w:after="0" w:line="200" w:lineRule="auto"/>
             </w:pPr>
             <w:r>
               <w:rPr>
@@ -16629,7 +16643,7 @@
           </w:p>
           <w:p>
             <w:pPr>
-              <w:spacing w:after="0" w:line="200"/>
+              <w:spacing w:after="0" w:line="200" w:lineRule="auto"/>
             </w:pPr>
             <w:r>
               <w:rPr>
@@ -16642,7 +16656,7 @@
           </w:p>
           <w:p>
             <w:pPr>
-              <w:spacing w:after="0" w:line="200"/>
+              <w:spacing w:after="0" w:line="200" w:lineRule="auto"/>
             </w:pPr>
             <w:r>
               <w:rPr>
@@ -16655,7 +16669,7 @@
           </w:p>
           <w:p>
             <w:pPr>
-              <w:spacing w:after="0" w:line="200"/>
+              <w:spacing w:after="0" w:line="200" w:lineRule="auto"/>
             </w:pPr>
             <w:r>
               <w:rPr>
@@ -16668,7 +16682,7 @@
           </w:p>
           <w:p>
             <w:pPr>
-              <w:spacing w:after="0" w:line="200"/>
+              <w:spacing w:after="0" w:line="200" w:lineRule="auto"/>
             </w:pPr>
             <w:r>
               <w:rPr>
@@ -16681,7 +16695,7 @@
           </w:p>
           <w:p>
             <w:pPr>
-              <w:spacing w:after="0" w:line="200"/>
+              <w:spacing w:after="0" w:line="200" w:lineRule="auto"/>
             </w:pPr>
             <w:r>
               <w:rPr>
@@ -16694,7 +16708,7 @@
           </w:p>
           <w:p>
             <w:pPr>
-              <w:spacing w:after="0" w:line="200"/>
+              <w:spacing w:after="0" w:line="200" w:lineRule="auto"/>
             </w:pPr>
             <w:r>
               <w:rPr>
@@ -16707,7 +16721,7 @@
           </w:p>
           <w:p>
             <w:pPr>
-              <w:spacing w:after="0" w:line="200"/>
+              <w:spacing w:after="0" w:line="200" w:lineRule="auto"/>
             </w:pPr>
             <w:r>
               <w:rPr>
@@ -16720,7 +16734,7 @@
           </w:p>
           <w:p>
             <w:pPr>
-              <w:spacing w:after="0" w:line="200"/>
+              <w:spacing w:after="0" w:line="200" w:lineRule="auto"/>
             </w:pPr>
             <w:r>
               <w:rPr>
@@ -16733,7 +16747,7 @@
           </w:p>
           <w:p>
             <w:pPr>
-              <w:spacing w:after="0" w:line="200"/>
+              <w:spacing w:after="0" w:line="200" w:lineRule="auto"/>
             </w:pPr>
             <w:r>
               <w:rPr>
@@ -16746,7 +16760,7 @@
           </w:p>
           <w:p>
             <w:pPr>
-              <w:spacing w:after="0" w:line="200"/>
+              <w:spacing w:after="0" w:line="200" w:lineRule="auto"/>
             </w:pPr>
             <w:r>
               <w:rPr>
@@ -16759,7 +16773,7 @@
           </w:p>
           <w:p>
             <w:pPr>
-              <w:spacing w:after="0" w:line="200"/>
+              <w:spacing w:after="0" w:line="200" w:lineRule="auto"/>
             </w:pPr>
             <w:r>
               <w:rPr>
@@ -16772,7 +16786,7 @@
           </w:p>
           <w:p>
             <w:pPr>
-              <w:spacing w:after="0" w:line="200"/>
+              <w:spacing w:after="0" w:line="200" w:lineRule="auto"/>
             </w:pPr>
             <w:r>
               <w:rPr>
@@ -16785,7 +16799,7 @@
           </w:p>
           <w:p>
             <w:pPr>
-              <w:spacing w:after="0" w:line="200"/>
+              <w:spacing w:after="0" w:line="200" w:lineRule="auto"/>
             </w:pPr>
             <w:r>
               <w:rPr>
@@ -16798,7 +16812,7 @@
           </w:p>
           <w:p>
             <w:pPr>
-              <w:spacing w:after="0" w:line="200"/>
+              <w:spacing w:after="0" w:line="200" w:lineRule="auto"/>
             </w:pPr>
             <w:r>
               <w:rPr>
@@ -16811,7 +16825,7 @@
           </w:p>
           <w:p>
             <w:pPr>
-              <w:spacing w:after="0" w:line="200"/>
+              <w:spacing w:after="0" w:line="200" w:lineRule="auto"/>
             </w:pPr>
             <w:r>
               <w:rPr>
@@ -16824,7 +16838,7 @@
           </w:p>
           <w:p>
             <w:pPr>
-              <w:spacing w:after="0" w:line="200"/>
+              <w:spacing w:after="0" w:line="200" w:lineRule="auto"/>
             </w:pPr>
             <w:r>
               <w:rPr>
@@ -16837,7 +16851,7 @@
           </w:p>
           <w:p>
             <w:pPr>
-              <w:spacing w:after="0" w:line="200"/>
+              <w:spacing w:after="0" w:line="200" w:lineRule="auto"/>
             </w:pPr>
             <w:r>
               <w:rPr>
@@ -16850,7 +16864,7 @@
           </w:p>
           <w:p>
             <w:pPr>
-              <w:spacing w:after="0" w:line="200"/>
+              <w:spacing w:after="0" w:line="200" w:lineRule="auto"/>
             </w:pPr>
             <w:r>
               <w:rPr>
@@ -16863,7 +16877,7 @@
           </w:p>
           <w:p>
             <w:pPr>
-              <w:spacing w:after="0" w:line="200"/>
+              <w:spacing w:after="0" w:line="200" w:lineRule="auto"/>
             </w:pPr>
             <w:r>
               <w:rPr>
@@ -16876,7 +16890,7 @@
           </w:p>
           <w:p>
             <w:pPr>
-              <w:spacing w:after="0" w:line="200"/>
+              <w:spacing w:after="0" w:line="200" w:lineRule="auto"/>
             </w:pPr>
             <w:r>
               <w:rPr>
@@ -16889,7 +16903,7 @@
           </w:p>
           <w:p>
             <w:pPr>
-              <w:spacing w:after="0" w:line="200"/>
+              <w:spacing w:after="0" w:line="200" w:lineRule="auto"/>
             </w:pPr>
             <w:r>
               <w:rPr>
@@ -16902,7 +16916,7 @@
           </w:p>
           <w:p>
             <w:pPr>
-              <w:spacing w:after="0" w:line="200"/>
+              <w:spacing w:after="0" w:line="200" w:lineRule="auto"/>
             </w:pPr>
             <w:r>
               <w:rPr>
@@ -16915,7 +16929,7 @@
           </w:p>
           <w:p>
             <w:pPr>
-              <w:spacing w:after="0" w:line="200"/>
+              <w:spacing w:after="0" w:line="200" w:lineRule="auto"/>
             </w:pPr>
             <w:r>
               <w:rPr>
@@ -16928,7 +16942,7 @@
           </w:p>
           <w:p>
             <w:pPr>
-              <w:spacing w:after="0" w:line="200"/>
+              <w:spacing w:after="0" w:line="200" w:lineRule="auto"/>
             </w:pPr>
             <w:r>
               <w:rPr>
@@ -16941,7 +16955,7 @@
           </w:p>
           <w:p>
             <w:pPr>
-              <w:spacing w:after="0" w:line="200"/>
+              <w:spacing w:after="0" w:line="200" w:lineRule="auto"/>
             </w:pPr>
             <w:r>
               <w:rPr>
@@ -16954,7 +16968,7 @@
           </w:p>
           <w:p>
             <w:pPr>
-              <w:spacing w:after="0" w:line="200"/>
+              <w:spacing w:after="0" w:line="200" w:lineRule="auto"/>
             </w:pPr>
             <w:r>
               <w:rPr>
@@ -16967,7 +16981,7 @@
           </w:p>
           <w:p>
             <w:pPr>
-              <w:spacing w:after="0" w:line="200"/>
+              <w:spacing w:after="0" w:line="200" w:lineRule="auto"/>
             </w:pPr>
             <w:r>
               <w:rPr>
@@ -16980,7 +16994,7 @@
           </w:p>
           <w:p>
             <w:pPr>
-              <w:spacing w:after="0" w:line="200"/>
+              <w:spacing w:after="0" w:line="200" w:lineRule="auto"/>
             </w:pPr>
             <w:r>
               <w:rPr>
@@ -16993,7 +17007,7 @@
           </w:p>
           <w:p>
             <w:pPr>
-              <w:spacing w:after="0" w:line="200"/>
+              <w:spacing w:after="0" w:line="200" w:lineRule="auto"/>
             </w:pPr>
             <w:r>
               <w:rPr>
@@ -17006,7 +17020,7 @@
           </w:p>
           <w:p>
             <w:pPr>
-              <w:spacing w:after="0" w:line="200"/>
+              <w:spacing w:after="0" w:line="200" w:lineRule="auto"/>
             </w:pPr>
             <w:r>
               <w:rPr>
@@ -17019,7 +17033,7 @@
           </w:p>
           <w:p>
             <w:pPr>
-              <w:spacing w:after="0" w:line="200"/>
+              <w:spacing w:after="0" w:line="200" w:lineRule="auto"/>
             </w:pPr>
             <w:r>
               <w:rPr>
@@ -17032,7 +17046,7 @@
           </w:p>
           <w:p>
             <w:pPr>
-              <w:spacing w:after="0" w:line="200"/>
+              <w:spacing w:after="0" w:line="200" w:lineRule="auto"/>
             </w:pPr>
             <w:r>
               <w:rPr>
@@ -17068,7 +17082,7 @@
     </w:p>
     <w:tbl>
       <w:tblPr>
-        <w:tblW w:type="pct" w:w="100%"/>
+        <w:tblW w:type="dxa" w:w="9350"/>
         <w:tblBorders>
           <w:top w:val="single" w:color="BFBFBF" w:sz="4"/>
           <w:left w:val="single" w:color="BFBFBF" w:sz="4"/>
@@ -17079,11 +17093,12 @@
         </w:tblBorders>
       </w:tblPr>
       <w:tblGrid>
-        <w:gridCol w:w="100"/>
+        <w:gridCol w:w="9350"/>
       </w:tblGrid>
       <w:tr>
         <w:tc>
           <w:tcPr>
+            <w:tcW w:type="dxa" w:w="9350"/>
             <w:shd w:fill="F7F7F7" w:val="clear"/>
             <w:tcMar>
               <w:top w:type="dxa" w:w="100"/>
@@ -17094,7 +17109,7 @@
           </w:tcPr>
           <w:p>
             <w:pPr>
-              <w:spacing w:after="0" w:line="200"/>
+              <w:spacing w:after="0" w:line="200" w:lineRule="auto"/>
             </w:pPr>
             <w:r>
               <w:rPr>
@@ -17107,7 +17122,7 @@
           </w:p>
           <w:p>
             <w:pPr>
-              <w:spacing w:after="0" w:line="200"/>
+              <w:spacing w:after="0" w:line="200" w:lineRule="auto"/>
             </w:pPr>
             <w:r>
               <w:rPr>
@@ -17120,7 +17135,7 @@
           </w:p>
           <w:p>
             <w:pPr>
-              <w:spacing w:after="0" w:line="200"/>
+              <w:spacing w:after="0" w:line="200" w:lineRule="auto"/>
             </w:pPr>
             <w:r>
               <w:rPr>
@@ -17133,7 +17148,7 @@
           </w:p>
           <w:p>
             <w:pPr>
-              <w:spacing w:after="0" w:line="200"/>
+              <w:spacing w:after="0" w:line="200" w:lineRule="auto"/>
             </w:pPr>
             <w:r>
               <w:rPr>
@@ -17146,7 +17161,7 @@
           </w:p>
           <w:p>
             <w:pPr>
-              <w:spacing w:after="0" w:line="200"/>
+              <w:spacing w:after="0" w:line="200" w:lineRule="auto"/>
             </w:pPr>
             <w:r>
               <w:rPr>
@@ -17159,7 +17174,7 @@
           </w:p>
           <w:p>
             <w:pPr>
-              <w:spacing w:after="0" w:line="200"/>
+              <w:spacing w:after="0" w:line="200" w:lineRule="auto"/>
             </w:pPr>
             <w:r>
               <w:rPr>
@@ -17172,7 +17187,7 @@
           </w:p>
           <w:p>
             <w:pPr>
-              <w:spacing w:after="0" w:line="200"/>
+              <w:spacing w:after="0" w:line="200" w:lineRule="auto"/>
             </w:pPr>
             <w:r>
               <w:rPr>
@@ -17185,7 +17200,7 @@
           </w:p>
           <w:p>
             <w:pPr>
-              <w:spacing w:after="0" w:line="200"/>
+              <w:spacing w:after="0" w:line="200" w:lineRule="auto"/>
             </w:pPr>
             <w:r>
               <w:rPr>
@@ -17198,7 +17213,7 @@
           </w:p>
           <w:p>
             <w:pPr>
-              <w:spacing w:after="0" w:line="200"/>
+              <w:spacing w:after="0" w:line="200" w:lineRule="auto"/>
             </w:pPr>
             <w:r>
               <w:rPr>
@@ -17211,7 +17226,7 @@
           </w:p>
           <w:p>
             <w:pPr>
-              <w:spacing w:after="0" w:line="200"/>
+              <w:spacing w:after="0" w:line="200" w:lineRule="auto"/>
             </w:pPr>
             <w:r>
               <w:rPr>
@@ -17224,7 +17239,7 @@
           </w:p>
           <w:p>
             <w:pPr>
-              <w:spacing w:after="0" w:line="200"/>
+              <w:spacing w:after="0" w:line="200" w:lineRule="auto"/>
             </w:pPr>
             <w:r>
               <w:rPr>
@@ -17237,7 +17252,7 @@
           </w:p>
           <w:p>
             <w:pPr>
-              <w:spacing w:after="0" w:line="200"/>
+              <w:spacing w:after="0" w:line="200" w:lineRule="auto"/>
             </w:pPr>
             <w:r>
               <w:rPr>
@@ -17250,7 +17265,7 @@
           </w:p>
           <w:p>
             <w:pPr>
-              <w:spacing w:after="0" w:line="200"/>
+              <w:spacing w:after="0" w:line="200" w:lineRule="auto"/>
             </w:pPr>
             <w:r>
               <w:rPr>
@@ -17263,7 +17278,7 @@
           </w:p>
           <w:p>
             <w:pPr>
-              <w:spacing w:after="0" w:line="200"/>
+              <w:spacing w:after="0" w:line="200" w:lineRule="auto"/>
             </w:pPr>
             <w:r>
               <w:rPr>
@@ -17276,7 +17291,7 @@
           </w:p>
           <w:p>
             <w:pPr>
-              <w:spacing w:after="0" w:line="200"/>
+              <w:spacing w:after="0" w:line="200" w:lineRule="auto"/>
             </w:pPr>
             <w:r>
               <w:rPr>
@@ -17289,7 +17304,7 @@
           </w:p>
           <w:p>
             <w:pPr>
-              <w:spacing w:after="0" w:line="200"/>
+              <w:spacing w:after="0" w:line="200" w:lineRule="auto"/>
             </w:pPr>
             <w:r>
               <w:rPr>
@@ -17302,7 +17317,7 @@
           </w:p>
           <w:p>
             <w:pPr>
-              <w:spacing w:after="0" w:line="200"/>
+              <w:spacing w:after="0" w:line="200" w:lineRule="auto"/>
             </w:pPr>
             <w:r>
               <w:rPr>
@@ -17315,7 +17330,7 @@
           </w:p>
           <w:p>
             <w:pPr>
-              <w:spacing w:after="0" w:line="200"/>
+              <w:spacing w:after="0" w:line="200" w:lineRule="auto"/>
             </w:pPr>
             <w:r>
               <w:rPr>
@@ -17328,7 +17343,7 @@
           </w:p>
           <w:p>
             <w:pPr>
-              <w:spacing w:after="0" w:line="200"/>
+              <w:spacing w:after="0" w:line="200" w:lineRule="auto"/>
             </w:pPr>
             <w:r>
               <w:rPr>
@@ -17341,7 +17356,7 @@
           </w:p>
           <w:p>
             <w:pPr>
-              <w:spacing w:after="0" w:line="200"/>
+              <w:spacing w:after="0" w:line="200" w:lineRule="auto"/>
             </w:pPr>
             <w:r>
               <w:rPr>
@@ -17354,7 +17369,7 @@
           </w:p>
           <w:p>
             <w:pPr>
-              <w:spacing w:after="0" w:line="200"/>
+              <w:spacing w:after="0" w:line="200" w:lineRule="auto"/>
             </w:pPr>
             <w:r>
               <w:rPr>
@@ -17367,7 +17382,7 @@
           </w:p>
           <w:p>
             <w:pPr>
-              <w:spacing w:after="0" w:line="200"/>
+              <w:spacing w:after="0" w:line="200" w:lineRule="auto"/>
             </w:pPr>
             <w:r>
               <w:rPr>
@@ -17380,7 +17395,7 @@
           </w:p>
           <w:p>
             <w:pPr>
-              <w:spacing w:after="0" w:line="200"/>
+              <w:spacing w:after="0" w:line="200" w:lineRule="auto"/>
             </w:pPr>
             <w:r>
               <w:rPr>
@@ -17393,7 +17408,7 @@
           </w:p>
           <w:p>
             <w:pPr>
-              <w:spacing w:after="0" w:line="200"/>
+              <w:spacing w:after="0" w:line="200" w:lineRule="auto"/>
             </w:pPr>
             <w:r>
               <w:rPr>
@@ -17406,7 +17421,7 @@
           </w:p>
           <w:p>
             <w:pPr>
-              <w:spacing w:after="0" w:line="200"/>
+              <w:spacing w:after="0" w:line="200" w:lineRule="auto"/>
             </w:pPr>
             <w:r>
               <w:rPr>
@@ -17419,7 +17434,7 @@
           </w:p>
           <w:p>
             <w:pPr>
-              <w:spacing w:after="0" w:line="200"/>
+              <w:spacing w:after="0" w:line="200" w:lineRule="auto"/>
             </w:pPr>
             <w:r>
               <w:rPr>
@@ -17432,7 +17447,7 @@
           </w:p>
           <w:p>
             <w:pPr>
-              <w:spacing w:after="0" w:line="200"/>
+              <w:spacing w:after="0" w:line="200" w:lineRule="auto"/>
             </w:pPr>
             <w:r>
               <w:rPr>
@@ -17445,7 +17460,7 @@
           </w:p>
           <w:p>
             <w:pPr>
-              <w:spacing w:after="0" w:line="200"/>
+              <w:spacing w:after="0" w:line="200" w:lineRule="auto"/>
             </w:pPr>
             <w:r>
               <w:rPr>
@@ -17458,7 +17473,7 @@
           </w:p>
           <w:p>
             <w:pPr>
-              <w:spacing w:after="0" w:line="200"/>
+              <w:spacing w:after="0" w:line="200" w:lineRule="auto"/>
             </w:pPr>
             <w:r>
               <w:rPr>
@@ -17471,7 +17486,7 @@
           </w:p>
           <w:p>
             <w:pPr>
-              <w:spacing w:after="0" w:line="200"/>
+              <w:spacing w:after="0" w:line="200" w:lineRule="auto"/>
             </w:pPr>
             <w:r>
               <w:rPr>
@@ -17484,7 +17499,7 @@
           </w:p>
           <w:p>
             <w:pPr>
-              <w:spacing w:after="0" w:line="200"/>
+              <w:spacing w:after="0" w:line="200" w:lineRule="auto"/>
             </w:pPr>
             <w:r>
               <w:rPr>
@@ -17497,7 +17512,7 @@
           </w:p>
           <w:p>
             <w:pPr>
-              <w:spacing w:after="0" w:line="200"/>
+              <w:spacing w:after="0" w:line="200" w:lineRule="auto"/>
             </w:pPr>
             <w:r>
               <w:rPr>
@@ -17510,7 +17525,7 @@
           </w:p>
           <w:p>
             <w:pPr>
-              <w:spacing w:after="0" w:line="200"/>
+              <w:spacing w:after="0" w:line="200" w:lineRule="auto"/>
             </w:pPr>
             <w:r>
               <w:rPr>
@@ -17523,7 +17538,7 @@
           </w:p>
           <w:p>
             <w:pPr>
-              <w:spacing w:after="0" w:line="200"/>
+              <w:spacing w:after="0" w:line="200" w:lineRule="auto"/>
             </w:pPr>
             <w:r>
               <w:rPr>
@@ -17536,7 +17551,7 @@
           </w:p>
           <w:p>
             <w:pPr>
-              <w:spacing w:after="0" w:line="200"/>
+              <w:spacing w:after="0" w:line="200" w:lineRule="auto"/>
             </w:pPr>
             <w:r>
               <w:rPr>
@@ -17549,7 +17564,7 @@
           </w:p>
           <w:p>
             <w:pPr>
-              <w:spacing w:after="0" w:line="200"/>
+              <w:spacing w:after="0" w:line="200" w:lineRule="auto"/>
             </w:pPr>
             <w:r>
               <w:rPr>
@@ -17562,7 +17577,7 @@
           </w:p>
           <w:p>
             <w:pPr>
-              <w:spacing w:after="0" w:line="200"/>
+              <w:spacing w:after="0" w:line="200" w:lineRule="auto"/>
             </w:pPr>
             <w:r>
               <w:rPr>
@@ -17575,7 +17590,7 @@
           </w:p>
           <w:p>
             <w:pPr>
-              <w:spacing w:after="0" w:line="200"/>
+              <w:spacing w:after="0" w:line="200" w:lineRule="auto"/>
             </w:pPr>
             <w:r>
               <w:rPr>
@@ -17588,7 +17603,7 @@
           </w:p>
           <w:p>
             <w:pPr>
-              <w:spacing w:after="0" w:line="200"/>
+              <w:spacing w:after="0" w:line="200" w:lineRule="auto"/>
             </w:pPr>
             <w:r>
               <w:rPr>
@@ -17601,7 +17616,7 @@
           </w:p>
           <w:p>
             <w:pPr>
-              <w:spacing w:after="0" w:line="200"/>
+              <w:spacing w:after="0" w:line="200" w:lineRule="auto"/>
             </w:pPr>
             <w:r>
               <w:rPr>
@@ -17614,7 +17629,7 @@
           </w:p>
           <w:p>
             <w:pPr>
-              <w:spacing w:after="0" w:line="200"/>
+              <w:spacing w:after="0" w:line="200" w:lineRule="auto"/>
             </w:pPr>
             <w:r>
               <w:rPr>
@@ -17627,7 +17642,7 @@
           </w:p>
           <w:p>
             <w:pPr>
-              <w:spacing w:after="0" w:line="200"/>
+              <w:spacing w:after="0" w:line="200" w:lineRule="auto"/>
             </w:pPr>
             <w:r>
               <w:rPr>
@@ -17640,7 +17655,7 @@
           </w:p>
           <w:p>
             <w:pPr>
-              <w:spacing w:after="0" w:line="200"/>
+              <w:spacing w:after="0" w:line="200" w:lineRule="auto"/>
             </w:pPr>
             <w:r>
               <w:rPr>
@@ -17653,7 +17668,7 @@
           </w:p>
           <w:p>
             <w:pPr>
-              <w:spacing w:after="0" w:line="200"/>
+              <w:spacing w:after="0" w:line="200" w:lineRule="auto"/>
             </w:pPr>
             <w:r>
               <w:rPr>
@@ -17666,7 +17681,7 @@
           </w:p>
           <w:p>
             <w:pPr>
-              <w:spacing w:after="0" w:line="200"/>
+              <w:spacing w:after="0" w:line="200" w:lineRule="auto"/>
             </w:pPr>
             <w:r>
               <w:rPr>
@@ -17679,7 +17694,7 @@
           </w:p>
           <w:p>
             <w:pPr>
-              <w:spacing w:after="0" w:line="200"/>
+              <w:spacing w:after="0" w:line="200" w:lineRule="auto"/>
             </w:pPr>
             <w:r>
               <w:rPr>
@@ -17692,7 +17707,7 @@
           </w:p>
           <w:p>
             <w:pPr>
-              <w:spacing w:after="0" w:line="200"/>
+              <w:spacing w:after="0" w:line="200" w:lineRule="auto"/>
             </w:pPr>
             <w:r>
               <w:rPr>
@@ -17705,7 +17720,7 @@
           </w:p>
           <w:p>
             <w:pPr>
-              <w:spacing w:after="0" w:line="200"/>
+              <w:spacing w:after="0" w:line="200" w:lineRule="auto"/>
             </w:pPr>
             <w:r>
               <w:rPr>
@@ -17718,7 +17733,7 @@
           </w:p>
           <w:p>
             <w:pPr>
-              <w:spacing w:after="0" w:line="200"/>
+              <w:spacing w:after="0" w:line="200" w:lineRule="auto"/>
             </w:pPr>
             <w:r>
               <w:rPr>
@@ -17731,7 +17746,7 @@
           </w:p>
           <w:p>
             <w:pPr>
-              <w:spacing w:after="0" w:line="200"/>
+              <w:spacing w:after="0" w:line="200" w:lineRule="auto"/>
             </w:pPr>
             <w:r>
               <w:rPr>
@@ -17744,7 +17759,7 @@
           </w:p>
           <w:p>
             <w:pPr>
-              <w:spacing w:after="0" w:line="200"/>
+              <w:spacing w:after="0" w:line="200" w:lineRule="auto"/>
             </w:pPr>
             <w:r>
               <w:rPr>
@@ -17757,7 +17772,7 @@
           </w:p>
           <w:p>
             <w:pPr>
-              <w:spacing w:after="0" w:line="200"/>
+              <w:spacing w:after="0" w:line="200" w:lineRule="auto"/>
             </w:pPr>
             <w:r>
               <w:rPr>
@@ -17770,7 +17785,7 @@
           </w:p>
           <w:p>
             <w:pPr>
-              <w:spacing w:after="0" w:line="200"/>
+              <w:spacing w:after="0" w:line="200" w:lineRule="auto"/>
             </w:pPr>
             <w:r>
               <w:rPr>
@@ -17783,7 +17798,7 @@
           </w:p>
           <w:p>
             <w:pPr>
-              <w:spacing w:after="0" w:line="200"/>
+              <w:spacing w:after="0" w:line="200" w:lineRule="auto"/>
             </w:pPr>
             <w:r>
               <w:rPr>
@@ -17796,7 +17811,7 @@
           </w:p>
           <w:p>
             <w:pPr>
-              <w:spacing w:after="0" w:line="200"/>
+              <w:spacing w:after="0" w:line="200" w:lineRule="auto"/>
             </w:pPr>
             <w:r>
               <w:rPr>
@@ -17809,7 +17824,7 @@
           </w:p>
           <w:p>
             <w:pPr>
-              <w:spacing w:after="0" w:line="200"/>
+              <w:spacing w:after="0" w:line="200" w:lineRule="auto"/>
             </w:pPr>
             <w:r>
               <w:rPr>
@@ -17822,7 +17837,7 @@
           </w:p>
           <w:p>
             <w:pPr>
-              <w:spacing w:after="0" w:line="200"/>
+              <w:spacing w:after="0" w:line="200" w:lineRule="auto"/>
             </w:pPr>
             <w:r>
               <w:rPr>
@@ -17835,7 +17850,7 @@
           </w:p>
           <w:p>
             <w:pPr>
-              <w:spacing w:after="0" w:line="200"/>
+              <w:spacing w:after="0" w:line="200" w:lineRule="auto"/>
             </w:pPr>
             <w:r>
               <w:rPr>
@@ -17848,7 +17863,7 @@
           </w:p>
           <w:p>
             <w:pPr>
-              <w:spacing w:after="0" w:line="200"/>
+              <w:spacing w:after="0" w:line="200" w:lineRule="auto"/>
             </w:pPr>
             <w:r>
               <w:rPr>
@@ -17861,7 +17876,7 @@
           </w:p>
           <w:p>
             <w:pPr>
-              <w:spacing w:after="0" w:line="200"/>
+              <w:spacing w:after="0" w:line="200" w:lineRule="auto"/>
             </w:pPr>
             <w:r>
               <w:rPr>
@@ -17874,7 +17889,7 @@
           </w:p>
           <w:p>
             <w:pPr>
-              <w:spacing w:after="0" w:line="200"/>
+              <w:spacing w:after="0" w:line="200" w:lineRule="auto"/>
             </w:pPr>
             <w:r>
               <w:rPr>
@@ -17887,7 +17902,7 @@
           </w:p>
           <w:p>
             <w:pPr>
-              <w:spacing w:after="0" w:line="200"/>
+              <w:spacing w:after="0" w:line="200" w:lineRule="auto"/>
             </w:pPr>
             <w:r>
               <w:rPr>
@@ -17900,7 +17915,7 @@
           </w:p>
           <w:p>
             <w:pPr>
-              <w:spacing w:after="0" w:line="200"/>
+              <w:spacing w:after="0" w:line="200" w:lineRule="auto"/>
             </w:pPr>
             <w:r>
               <w:rPr>
@@ -17913,7 +17928,7 @@
           </w:p>
           <w:p>
             <w:pPr>
-              <w:spacing w:after="0" w:line="200"/>
+              <w:spacing w:after="0" w:line="200" w:lineRule="auto"/>
             </w:pPr>
             <w:r>
               <w:rPr>
@@ -17926,7 +17941,7 @@
           </w:p>
           <w:p>
             <w:pPr>
-              <w:spacing w:after="0" w:line="200"/>
+              <w:spacing w:after="0" w:line="200" w:lineRule="auto"/>
             </w:pPr>
             <w:r>
               <w:rPr>
@@ -17939,7 +17954,7 @@
           </w:p>
           <w:p>
             <w:pPr>
-              <w:spacing w:after="0" w:line="200"/>
+              <w:spacing w:after="0" w:line="200" w:lineRule="auto"/>
             </w:pPr>
             <w:r>
               <w:rPr>
@@ -17975,7 +17990,7 @@
     </w:p>
     <w:tbl>
       <w:tblPr>
-        <w:tblW w:type="pct" w:w="100%"/>
+        <w:tblW w:type="dxa" w:w="9350"/>
         <w:tblBorders>
           <w:top w:val="single" w:color="BFBFBF" w:sz="4"/>
           <w:left w:val="single" w:color="BFBFBF" w:sz="4"/>
@@ -17986,11 +18001,12 @@
         </w:tblBorders>
       </w:tblPr>
       <w:tblGrid>
-        <w:gridCol w:w="100"/>
+        <w:gridCol w:w="9350"/>
       </w:tblGrid>
       <w:tr>
         <w:tc>
           <w:tcPr>
+            <w:tcW w:type="dxa" w:w="9350"/>
             <w:shd w:fill="F7F7F7" w:val="clear"/>
             <w:tcMar>
               <w:top w:type="dxa" w:w="100"/>
@@ -18001,7 +18017,7 @@
           </w:tcPr>
           <w:p>
             <w:pPr>
-              <w:spacing w:after="0" w:line="200"/>
+              <w:spacing w:after="0" w:line="200" w:lineRule="auto"/>
             </w:pPr>
             <w:r>
               <w:rPr>
@@ -18014,7 +18030,7 @@
           </w:p>
           <w:p>
             <w:pPr>
-              <w:spacing w:after="0" w:line="200"/>
+              <w:spacing w:after="0" w:line="200" w:lineRule="auto"/>
             </w:pPr>
             <w:r>
               <w:rPr>
@@ -18027,7 +18043,7 @@
           </w:p>
           <w:p>
             <w:pPr>
-              <w:spacing w:after="0" w:line="200"/>
+              <w:spacing w:after="0" w:line="200" w:lineRule="auto"/>
             </w:pPr>
             <w:r>
               <w:rPr>
@@ -18040,7 +18056,7 @@
           </w:p>
           <w:p>
             <w:pPr>
-              <w:spacing w:after="0" w:line="200"/>
+              <w:spacing w:after="0" w:line="200" w:lineRule="auto"/>
             </w:pPr>
             <w:r>
               <w:rPr>
@@ -18053,7 +18069,7 @@
           </w:p>
           <w:p>
             <w:pPr>
-              <w:spacing w:after="0" w:line="200"/>
+              <w:spacing w:after="0" w:line="200" w:lineRule="auto"/>
             </w:pPr>
             <w:r>
               <w:rPr>
@@ -18066,7 +18082,7 @@
           </w:p>
           <w:p>
             <w:pPr>
-              <w:spacing w:after="0" w:line="200"/>
+              <w:spacing w:after="0" w:line="200" w:lineRule="auto"/>
             </w:pPr>
             <w:r>
               <w:rPr>
@@ -18079,7 +18095,7 @@
           </w:p>
           <w:p>
             <w:pPr>
-              <w:spacing w:after="0" w:line="200"/>
+              <w:spacing w:after="0" w:line="200" w:lineRule="auto"/>
             </w:pPr>
             <w:r>
               <w:rPr>
@@ -18092,7 +18108,7 @@
           </w:p>
           <w:p>
             <w:pPr>
-              <w:spacing w:after="0" w:line="200"/>
+              <w:spacing w:after="0" w:line="200" w:lineRule="auto"/>
             </w:pPr>
             <w:r>
               <w:rPr>
@@ -18105,7 +18121,7 @@
           </w:p>
           <w:p>
             <w:pPr>
-              <w:spacing w:after="0" w:line="200"/>
+              <w:spacing w:after="0" w:line="200" w:lineRule="auto"/>
             </w:pPr>
             <w:r>
               <w:rPr>
@@ -18118,7 +18134,7 @@
           </w:p>
           <w:p>
             <w:pPr>
-              <w:spacing w:after="0" w:line="200"/>
+              <w:spacing w:after="0" w:line="200" w:lineRule="auto"/>
             </w:pPr>
             <w:r>
               <w:rPr>
@@ -18131,7 +18147,7 @@
           </w:p>
           <w:p>
             <w:pPr>
-              <w:spacing w:after="0" w:line="200"/>
+              <w:spacing w:after="0" w:line="200" w:lineRule="auto"/>
             </w:pPr>
             <w:r>
               <w:rPr>
@@ -18144,7 +18160,7 @@
           </w:p>
           <w:p>
             <w:pPr>
-              <w:spacing w:after="0" w:line="200"/>
+              <w:spacing w:after="0" w:line="200" w:lineRule="auto"/>
             </w:pPr>
             <w:r>
               <w:rPr>
@@ -18157,7 +18173,7 @@
           </w:p>
           <w:p>
             <w:pPr>
-              <w:spacing w:after="0" w:line="200"/>
+              <w:spacing w:after="0" w:line="200" w:lineRule="auto"/>
             </w:pPr>
             <w:r>
               <w:rPr>
@@ -18170,7 +18186,7 @@
           </w:p>
           <w:p>
             <w:pPr>
-              <w:spacing w:after="0" w:line="200"/>
+              <w:spacing w:after="0" w:line="200" w:lineRule="auto"/>
             </w:pPr>
             <w:r>
               <w:rPr>
@@ -18183,7 +18199,7 @@
           </w:p>
           <w:p>
             <w:pPr>
-              <w:spacing w:after="0" w:line="200"/>
+              <w:spacing w:after="0" w:line="200" w:lineRule="auto"/>
             </w:pPr>
             <w:r>
               <w:rPr>
@@ -18196,7 +18212,7 @@
           </w:p>
           <w:p>
             <w:pPr>
-              <w:spacing w:after="0" w:line="200"/>
+              <w:spacing w:after="0" w:line="200" w:lineRule="auto"/>
             </w:pPr>
             <w:r>
               <w:rPr>
@@ -18209,7 +18225,7 @@
           </w:p>
           <w:p>
             <w:pPr>
-              <w:spacing w:after="0" w:line="200"/>
+              <w:spacing w:after="0" w:line="200" w:lineRule="auto"/>
             </w:pPr>
             <w:r>
               <w:rPr>
@@ -18222,7 +18238,7 @@
           </w:p>
           <w:p>
             <w:pPr>
-              <w:spacing w:after="0" w:line="200"/>
+              <w:spacing w:after="0" w:line="200" w:lineRule="auto"/>
             </w:pPr>
             <w:r>
               <w:rPr>
@@ -18235,7 +18251,7 @@
           </w:p>
           <w:p>
             <w:pPr>
-              <w:spacing w:after="0" w:line="200"/>
+              <w:spacing w:after="0" w:line="200" w:lineRule="auto"/>
             </w:pPr>
             <w:r>
               <w:rPr>
@@ -18248,7 +18264,7 @@
           </w:p>
           <w:p>
             <w:pPr>
-              <w:spacing w:after="0" w:line="200"/>
+              <w:spacing w:after="0" w:line="200" w:lineRule="auto"/>
             </w:pPr>
             <w:r>
               <w:rPr>
@@ -18261,7 +18277,7 @@
           </w:p>
           <w:p>
             <w:pPr>
-              <w:spacing w:after="0" w:line="200"/>
+              <w:spacing w:after="0" w:line="200" w:lineRule="auto"/>
             </w:pPr>
             <w:r>
               <w:rPr>
@@ -18274,7 +18290,7 @@
           </w:p>
           <w:p>
             <w:pPr>
-              <w:spacing w:after="0" w:line="200"/>
+              <w:spacing w:after="0" w:line="200" w:lineRule="auto"/>
             </w:pPr>
             <w:r>
               <w:rPr>
@@ -18287,7 +18303,7 @@
           </w:p>
           <w:p>
             <w:pPr>
-              <w:spacing w:after="0" w:line="200"/>
+              <w:spacing w:after="0" w:line="200" w:lineRule="auto"/>
             </w:pPr>
             <w:r>
               <w:rPr>
@@ -18300,7 +18316,7 @@
           </w:p>
           <w:p>
             <w:pPr>
-              <w:spacing w:after="0" w:line="200"/>
+              <w:spacing w:after="0" w:line="200" w:lineRule="auto"/>
             </w:pPr>
             <w:r>
               <w:rPr>
@@ -18313,7 +18329,7 @@
           </w:p>
           <w:p>
             <w:pPr>
-              <w:spacing w:after="0" w:line="200"/>
+              <w:spacing w:after="0" w:line="200" w:lineRule="auto"/>
             </w:pPr>
             <w:r>
               <w:rPr>
@@ -18326,7 +18342,7 @@
           </w:p>
           <w:p>
             <w:pPr>
-              <w:spacing w:after="0" w:line="200"/>
+              <w:spacing w:after="0" w:line="200" w:lineRule="auto"/>
             </w:pPr>
             <w:r>
               <w:rPr>
@@ -18339,7 +18355,7 @@
           </w:p>
           <w:p>
             <w:pPr>
-              <w:spacing w:after="0" w:line="200"/>
+              <w:spacing w:after="0" w:line="200" w:lineRule="auto"/>
             </w:pPr>
             <w:r>
               <w:rPr>
@@ -18352,7 +18368,7 @@
           </w:p>
           <w:p>
             <w:pPr>
-              <w:spacing w:after="0" w:line="200"/>
+              <w:spacing w:after="0" w:line="200" w:lineRule="auto"/>
             </w:pPr>
             <w:r>
               <w:rPr>
@@ -18365,7 +18381,7 @@
           </w:p>
           <w:p>
             <w:pPr>
-              <w:spacing w:after="0" w:line="200"/>
+              <w:spacing w:after="0" w:line="200" w:lineRule="auto"/>
             </w:pPr>
             <w:r>
               <w:rPr>
@@ -18378,7 +18394,7 @@
           </w:p>
           <w:p>
             <w:pPr>
-              <w:spacing w:after="0" w:line="200"/>
+              <w:spacing w:after="0" w:line="200" w:lineRule="auto"/>
             </w:pPr>
             <w:r>
               <w:rPr>
@@ -18391,7 +18407,7 @@
           </w:p>
           <w:p>
             <w:pPr>
-              <w:spacing w:after="0" w:line="200"/>
+              <w:spacing w:after="0" w:line="200" w:lineRule="auto"/>
             </w:pPr>
             <w:r>
               <w:rPr>
@@ -18404,7 +18420,7 @@
           </w:p>
           <w:p>
             <w:pPr>
-              <w:spacing w:after="0" w:line="200"/>
+              <w:spacing w:after="0" w:line="200" w:lineRule="auto"/>
             </w:pPr>
             <w:r>
               <w:rPr>
@@ -18417,7 +18433,7 @@
           </w:p>
           <w:p>
             <w:pPr>
-              <w:spacing w:after="0" w:line="200"/>
+              <w:spacing w:after="0" w:line="200" w:lineRule="auto"/>
             </w:pPr>
             <w:r>
               <w:rPr>
@@ -18430,7 +18446,7 @@
           </w:p>
           <w:p>
             <w:pPr>
-              <w:spacing w:after="0" w:line="200"/>
+              <w:spacing w:after="0" w:line="200" w:lineRule="auto"/>
             </w:pPr>
             <w:r>
               <w:rPr>
@@ -18443,7 +18459,7 @@
           </w:p>
           <w:p>
             <w:pPr>
-              <w:spacing w:after="0" w:line="200"/>
+              <w:spacing w:after="0" w:line="200" w:lineRule="auto"/>
             </w:pPr>
             <w:r>
               <w:rPr>
@@ -18456,7 +18472,7 @@
           </w:p>
           <w:p>
             <w:pPr>
-              <w:spacing w:after="0" w:line="200"/>
+              <w:spacing w:after="0" w:line="200" w:lineRule="auto"/>
             </w:pPr>
             <w:r>
               <w:rPr>
@@ -18469,7 +18485,7 @@
           </w:p>
           <w:p>
             <w:pPr>
-              <w:spacing w:after="0" w:line="200"/>
+              <w:spacing w:after="0" w:line="200" w:lineRule="auto"/>
             </w:pPr>
             <w:r>
               <w:rPr>
@@ -18482,7 +18498,7 @@
           </w:p>
           <w:p>
             <w:pPr>
-              <w:spacing w:after="0" w:line="200"/>
+              <w:spacing w:after="0" w:line="200" w:lineRule="auto"/>
             </w:pPr>
             <w:r>
               <w:rPr>
@@ -18495,7 +18511,7 @@
           </w:p>
           <w:p>
             <w:pPr>
-              <w:spacing w:after="0" w:line="200"/>
+              <w:spacing w:after="0" w:line="200" w:lineRule="auto"/>
             </w:pPr>
             <w:r>
               <w:rPr>
@@ -18508,7 +18524,7 @@
           </w:p>
           <w:p>
             <w:pPr>
-              <w:spacing w:after="0" w:line="200"/>
+              <w:spacing w:after="0" w:line="200" w:lineRule="auto"/>
             </w:pPr>
             <w:r>
               <w:rPr>
@@ -18521,7 +18537,7 @@
           </w:p>
           <w:p>
             <w:pPr>
-              <w:spacing w:after="0" w:line="200"/>
+              <w:spacing w:after="0" w:line="200" w:lineRule="auto"/>
             </w:pPr>
             <w:r>
               <w:rPr>
@@ -18534,7 +18550,7 @@
           </w:p>
           <w:p>
             <w:pPr>
-              <w:spacing w:after="0" w:line="200"/>
+              <w:spacing w:after="0" w:line="200" w:lineRule="auto"/>
             </w:pPr>
             <w:r>
               <w:rPr>
@@ -18547,7 +18563,7 @@
           </w:p>
           <w:p>
             <w:pPr>
-              <w:spacing w:after="0" w:line="200"/>
+              <w:spacing w:after="0" w:line="200" w:lineRule="auto"/>
             </w:pPr>
             <w:r>
               <w:rPr>
@@ -18560,7 +18576,7 @@
           </w:p>
           <w:p>
             <w:pPr>
-              <w:spacing w:after="0" w:line="200"/>
+              <w:spacing w:after="0" w:line="200" w:lineRule="auto"/>
             </w:pPr>
             <w:r>
               <w:rPr>
@@ -18573,7 +18589,7 @@
           </w:p>
           <w:p>
             <w:pPr>
-              <w:spacing w:after="0" w:line="200"/>
+              <w:spacing w:after="0" w:line="200" w:lineRule="auto"/>
             </w:pPr>
             <w:r>
               <w:rPr>
@@ -18586,7 +18602,7 @@
           </w:p>
           <w:p>
             <w:pPr>
-              <w:spacing w:after="0" w:line="200"/>
+              <w:spacing w:after="0" w:line="200" w:lineRule="auto"/>
             </w:pPr>
             <w:r>
               <w:rPr>
@@ -18599,7 +18615,7 @@
           </w:p>
           <w:p>
             <w:pPr>
-              <w:spacing w:after="0" w:line="200"/>
+              <w:spacing w:after="0" w:line="200" w:lineRule="auto"/>
             </w:pPr>
             <w:r>
               <w:rPr>
@@ -18612,7 +18628,7 @@
           </w:p>
           <w:p>
             <w:pPr>
-              <w:spacing w:after="0" w:line="200"/>
+              <w:spacing w:after="0" w:line="200" w:lineRule="auto"/>
             </w:pPr>
             <w:r>
               <w:rPr>
@@ -18625,7 +18641,7 @@
           </w:p>
           <w:p>
             <w:pPr>
-              <w:spacing w:after="0" w:line="200"/>
+              <w:spacing w:after="0" w:line="200" w:lineRule="auto"/>
             </w:pPr>
             <w:r>
               <w:rPr>
@@ -18638,7 +18654,7 @@
           </w:p>
           <w:p>
             <w:pPr>
-              <w:spacing w:after="0" w:line="200"/>
+              <w:spacing w:after="0" w:line="200" w:lineRule="auto"/>
             </w:pPr>
             <w:r>
               <w:rPr>
@@ -18651,7 +18667,7 @@
           </w:p>
           <w:p>
             <w:pPr>
-              <w:spacing w:after="0" w:line="200"/>
+              <w:spacing w:after="0" w:line="200" w:lineRule="auto"/>
             </w:pPr>
             <w:r>
               <w:rPr>
@@ -18664,7 +18680,7 @@
           </w:p>
           <w:p>
             <w:pPr>
-              <w:spacing w:after="0" w:line="200"/>
+              <w:spacing w:after="0" w:line="200" w:lineRule="auto"/>
             </w:pPr>
             <w:r>
               <w:rPr>
@@ -18677,7 +18693,7 @@
           </w:p>
           <w:p>
             <w:pPr>
-              <w:spacing w:after="0" w:line="200"/>
+              <w:spacing w:after="0" w:line="200" w:lineRule="auto"/>
             </w:pPr>
             <w:r>
               <w:rPr>
@@ -18690,7 +18706,7 @@
           </w:p>
           <w:p>
             <w:pPr>
-              <w:spacing w:after="0" w:line="200"/>
+              <w:spacing w:after="0" w:line="200" w:lineRule="auto"/>
             </w:pPr>
             <w:r>
               <w:rPr>
@@ -18703,7 +18719,7 @@
           </w:p>
           <w:p>
             <w:pPr>
-              <w:spacing w:after="0" w:line="200"/>
+              <w:spacing w:after="0" w:line="200" w:lineRule="auto"/>
             </w:pPr>
             <w:r>
               <w:rPr>
@@ -18716,7 +18732,7 @@
           </w:p>
           <w:p>
             <w:pPr>
-              <w:spacing w:after="0" w:line="200"/>
+              <w:spacing w:after="0" w:line="200" w:lineRule="auto"/>
             </w:pPr>
             <w:r>
               <w:rPr>
@@ -18729,7 +18745,7 @@
           </w:p>
           <w:p>
             <w:pPr>
-              <w:spacing w:after="0" w:line="200"/>
+              <w:spacing w:after="0" w:line="200" w:lineRule="auto"/>
             </w:pPr>
             <w:r>
               <w:rPr>
@@ -18742,7 +18758,7 @@
           </w:p>
           <w:p>
             <w:pPr>
-              <w:spacing w:after="0" w:line="200"/>
+              <w:spacing w:after="0" w:line="200" w:lineRule="auto"/>
             </w:pPr>
             <w:r>
               <w:rPr>
@@ -18755,7 +18771,7 @@
           </w:p>
           <w:p>
             <w:pPr>
-              <w:spacing w:after="0" w:line="200"/>
+              <w:spacing w:after="0" w:line="200" w:lineRule="auto"/>
             </w:pPr>
             <w:r>
               <w:rPr>
@@ -18768,7 +18784,7 @@
           </w:p>
           <w:p>
             <w:pPr>
-              <w:spacing w:after="0" w:line="200"/>
+              <w:spacing w:after="0" w:line="200" w:lineRule="auto"/>
             </w:pPr>
             <w:r>
               <w:rPr>
@@ -18781,7 +18797,7 @@
           </w:p>
           <w:p>
             <w:pPr>
-              <w:spacing w:after="0" w:line="200"/>
+              <w:spacing w:after="0" w:line="200" w:lineRule="auto"/>
             </w:pPr>
             <w:r>
               <w:rPr>
@@ -18794,7 +18810,7 @@
           </w:p>
           <w:p>
             <w:pPr>
-              <w:spacing w:after="0" w:line="200"/>
+              <w:spacing w:after="0" w:line="200" w:lineRule="auto"/>
             </w:pPr>
             <w:r>
               <w:rPr>
@@ -18807,7 +18823,7 @@
           </w:p>
           <w:p>
             <w:pPr>
-              <w:spacing w:after="0" w:line="200"/>
+              <w:spacing w:after="0" w:line="200" w:lineRule="auto"/>
             </w:pPr>
             <w:r>
               <w:rPr>
@@ -18820,7 +18836,7 @@
           </w:p>
           <w:p>
             <w:pPr>
-              <w:spacing w:after="0" w:line="200"/>
+              <w:spacing w:after="0" w:line="200" w:lineRule="auto"/>
             </w:pPr>
             <w:r>
               <w:rPr>
@@ -18833,7 +18849,7 @@
           </w:p>
           <w:p>
             <w:pPr>
-              <w:spacing w:after="0" w:line="200"/>
+              <w:spacing w:after="0" w:line="200" w:lineRule="auto"/>
             </w:pPr>
             <w:r>
               <w:rPr>
@@ -18869,7 +18885,7 @@
     </w:p>
     <w:tbl>
       <w:tblPr>
-        <w:tblW w:type="pct" w:w="100%"/>
+        <w:tblW w:type="dxa" w:w="9350"/>
         <w:tblBorders>
           <w:top w:val="single" w:color="BFBFBF" w:sz="4"/>
           <w:left w:val="single" w:color="BFBFBF" w:sz="4"/>
@@ -18880,11 +18896,12 @@
         </w:tblBorders>
       </w:tblPr>
       <w:tblGrid>
-        <w:gridCol w:w="100"/>
+        <w:gridCol w:w="9350"/>
       </w:tblGrid>
       <w:tr>
         <w:tc>
           <w:tcPr>
+            <w:tcW w:type="dxa" w:w="9350"/>
             <w:shd w:fill="F7F7F7" w:val="clear"/>
             <w:tcMar>
               <w:top w:type="dxa" w:w="100"/>
@@ -18895,7 +18912,7 @@
           </w:tcPr>
           <w:p>
             <w:pPr>
-              <w:spacing w:after="0" w:line="200"/>
+              <w:spacing w:after="0" w:line="200" w:lineRule="auto"/>
             </w:pPr>
             <w:r>
               <w:rPr>
@@ -18908,7 +18925,7 @@
           </w:p>
           <w:p>
             <w:pPr>
-              <w:spacing w:after="0" w:line="200"/>
+              <w:spacing w:after="0" w:line="200" w:lineRule="auto"/>
             </w:pPr>
             <w:r>
               <w:rPr>
@@ -18921,7 +18938,7 @@
           </w:p>
           <w:p>
             <w:pPr>
-              <w:spacing w:after="0" w:line="200"/>
+              <w:spacing w:after="0" w:line="200" w:lineRule="auto"/>
             </w:pPr>
             <w:r>
               <w:rPr>
@@ -18934,7 +18951,7 @@
           </w:p>
           <w:p>
             <w:pPr>
-              <w:spacing w:after="0" w:line="200"/>
+              <w:spacing w:after="0" w:line="200" w:lineRule="auto"/>
             </w:pPr>
             <w:r>
               <w:rPr>
@@ -18947,7 +18964,7 @@
           </w:p>
           <w:p>
             <w:pPr>
-              <w:spacing w:after="0" w:line="200"/>
+              <w:spacing w:after="0" w:line="200" w:lineRule="auto"/>
             </w:pPr>
             <w:r>
               <w:rPr>
@@ -18960,7 +18977,7 @@
           </w:p>
           <w:p>
             <w:pPr>
-              <w:spacing w:after="0" w:line="200"/>
+              <w:spacing w:after="0" w:line="200" w:lineRule="auto"/>
             </w:pPr>
             <w:r>
               <w:rPr>
@@ -18973,7 +18990,7 @@
           </w:p>
           <w:p>
             <w:pPr>
-              <w:spacing w:after="0" w:line="200"/>
+              <w:spacing w:after="0" w:line="200" w:lineRule="auto"/>
             </w:pPr>
             <w:r>
               <w:rPr>
@@ -18986,7 +19003,7 @@
           </w:p>
           <w:p>
             <w:pPr>
-              <w:spacing w:after="0" w:line="200"/>
+              <w:spacing w:after="0" w:line="200" w:lineRule="auto"/>
             </w:pPr>
             <w:r>
               <w:rPr>
@@ -18999,7 +19016,7 @@
           </w:p>
           <w:p>
             <w:pPr>
-              <w:spacing w:after="0" w:line="200"/>
+              <w:spacing w:after="0" w:line="200" w:lineRule="auto"/>
             </w:pPr>
             <w:r>
               <w:rPr>
@@ -19012,7 +19029,7 @@
           </w:p>
           <w:p>
             <w:pPr>
-              <w:spacing w:after="0" w:line="200"/>
+              <w:spacing w:after="0" w:line="200" w:lineRule="auto"/>
             </w:pPr>
             <w:r>
               <w:rPr>
@@ -19025,7 +19042,7 @@
           </w:p>
           <w:p>
             <w:pPr>
-              <w:spacing w:after="0" w:line="200"/>
+              <w:spacing w:after="0" w:line="200" w:lineRule="auto"/>
             </w:pPr>
             <w:r>
               <w:rPr>
@@ -19038,7 +19055,7 @@
           </w:p>
           <w:p>
             <w:pPr>
-              <w:spacing w:after="0" w:line="200"/>
+              <w:spacing w:after="0" w:line="200" w:lineRule="auto"/>
             </w:pPr>
             <w:r>
               <w:rPr>
@@ -19051,7 +19068,7 @@
           </w:p>
           <w:p>
             <w:pPr>
-              <w:spacing w:after="0" w:line="200"/>
+              <w:spacing w:after="0" w:line="200" w:lineRule="auto"/>
             </w:pPr>
             <w:r>
               <w:rPr>
@@ -19064,7 +19081,7 @@
           </w:p>
           <w:p>
             <w:pPr>
-              <w:spacing w:after="0" w:line="200"/>
+              <w:spacing w:after="0" w:line="200" w:lineRule="auto"/>
             </w:pPr>
             <w:r>
               <w:rPr>
@@ -19077,7 +19094,7 @@
           </w:p>
           <w:p>
             <w:pPr>
-              <w:spacing w:after="0" w:line="200"/>
+              <w:spacing w:after="0" w:line="200" w:lineRule="auto"/>
             </w:pPr>
             <w:r>
               <w:rPr>
@@ -19090,7 +19107,7 @@
           </w:p>
           <w:p>
             <w:pPr>
-              <w:spacing w:after="0" w:line="200"/>
+              <w:spacing w:after="0" w:line="200" w:lineRule="auto"/>
             </w:pPr>
             <w:r>
               <w:rPr>
@@ -19103,7 +19120,7 @@
           </w:p>
           <w:p>
             <w:pPr>
-              <w:spacing w:after="0" w:line="200"/>
+              <w:spacing w:after="0" w:line="200" w:lineRule="auto"/>
             </w:pPr>
             <w:r>
               <w:rPr>
@@ -19116,7 +19133,7 @@
           </w:p>
           <w:p>
             <w:pPr>
-              <w:spacing w:after="0" w:line="200"/>
+              <w:spacing w:after="0" w:line="200" w:lineRule="auto"/>
             </w:pPr>
             <w:r>
               <w:rPr>
@@ -19129,7 +19146,7 @@
           </w:p>
           <w:p>
             <w:pPr>
-              <w:spacing w:after="0" w:line="200"/>
+              <w:spacing w:after="0" w:line="200" w:lineRule="auto"/>
             </w:pPr>
             <w:r>
               <w:rPr>
@@ -19142,7 +19159,7 @@
           </w:p>
           <w:p>
             <w:pPr>
-              <w:spacing w:after="0" w:line="200"/>
+              <w:spacing w:after="0" w:line="200" w:lineRule="auto"/>
             </w:pPr>
             <w:r>
               <w:rPr>
@@ -19155,7 +19172,7 @@
           </w:p>
           <w:p>
             <w:pPr>
-              <w:spacing w:after="0" w:line="200"/>
+              <w:spacing w:after="0" w:line="200" w:lineRule="auto"/>
             </w:pPr>
             <w:r>
               <w:rPr>
@@ -19168,7 +19185,7 @@
           </w:p>
           <w:p>
             <w:pPr>
-              <w:spacing w:after="0" w:line="200"/>
+              <w:spacing w:after="0" w:line="200" w:lineRule="auto"/>
             </w:pPr>
             <w:r>
               <w:rPr>
@@ -19181,7 +19198,7 @@
           </w:p>
           <w:p>
             <w:pPr>
-              <w:spacing w:after="0" w:line="200"/>
+              <w:spacing w:after="0" w:line="200" w:lineRule="auto"/>
             </w:pPr>
             <w:r>
               <w:rPr>
@@ -19194,7 +19211,7 @@
           </w:p>
           <w:p>
             <w:pPr>
-              <w:spacing w:after="0" w:line="200"/>
+              <w:spacing w:after="0" w:line="200" w:lineRule="auto"/>
             </w:pPr>
             <w:r>
               <w:rPr>
@@ -19207,7 +19224,7 @@
           </w:p>
           <w:p>
             <w:pPr>
-              <w:spacing w:after="0" w:line="200"/>
+              <w:spacing w:after="0" w:line="200" w:lineRule="auto"/>
             </w:pPr>
             <w:r>
               <w:rPr>
@@ -19220,7 +19237,7 @@
           </w:p>
           <w:p>
             <w:pPr>
-              <w:spacing w:after="0" w:line="200"/>
+              <w:spacing w:after="0" w:line="200" w:lineRule="auto"/>
             </w:pPr>
             <w:r>
               <w:rPr>
@@ -19233,7 +19250,7 @@
           </w:p>
           <w:p>
             <w:pPr>
-              <w:spacing w:after="0" w:line="200"/>
+              <w:spacing w:after="0" w:line="200" w:lineRule="auto"/>
             </w:pPr>
             <w:r>
               <w:rPr>
@@ -19246,7 +19263,7 @@
           </w:p>
           <w:p>
             <w:pPr>
-              <w:spacing w:after="0" w:line="200"/>
+              <w:spacing w:after="0" w:line="200" w:lineRule="auto"/>
             </w:pPr>
             <w:r>
               <w:rPr>
@@ -19259,7 +19276,7 @@
           </w:p>
           <w:p>
             <w:pPr>
-              <w:spacing w:after="0" w:line="200"/>
+              <w:spacing w:after="0" w:line="200" w:lineRule="auto"/>
             </w:pPr>
             <w:r>
               <w:rPr>
@@ -19272,7 +19289,7 @@
           </w:p>
           <w:p>
             <w:pPr>
-              <w:spacing w:after="0" w:line="200"/>
+              <w:spacing w:after="0" w:line="200" w:lineRule="auto"/>
             </w:pPr>
             <w:r>
               <w:rPr>
@@ -19285,7 +19302,7 @@
           </w:p>
           <w:p>
             <w:pPr>
-              <w:spacing w:after="0" w:line="200"/>
+              <w:spacing w:after="0" w:line="200" w:lineRule="auto"/>
             </w:pPr>
             <w:r>
               <w:rPr>
@@ -19298,7 +19315,7 @@
           </w:p>
           <w:p>
             <w:pPr>
-              <w:spacing w:after="0" w:line="200"/>
+              <w:spacing w:after="0" w:line="200" w:lineRule="auto"/>
             </w:pPr>
             <w:r>
               <w:rPr>
@@ -19311,7 +19328,7 @@
           </w:p>
           <w:p>
             <w:pPr>
-              <w:spacing w:after="0" w:line="200"/>
+              <w:spacing w:after="0" w:line="200" w:lineRule="auto"/>
             </w:pPr>
             <w:r>
               <w:rPr>
@@ -19324,7 +19341,7 @@
           </w:p>
           <w:p>
             <w:pPr>
-              <w:spacing w:after="0" w:line="200"/>
+              <w:spacing w:after="0" w:line="200" w:lineRule="auto"/>
             </w:pPr>
             <w:r>
               <w:rPr>
@@ -19337,7 +19354,7 @@
           </w:p>
           <w:p>
             <w:pPr>
-              <w:spacing w:after="0" w:line="200"/>
+              <w:spacing w:after="0" w:line="200" w:lineRule="auto"/>
             </w:pPr>
             <w:r>
               <w:rPr>
@@ -19350,7 +19367,7 @@
           </w:p>
           <w:p>
             <w:pPr>
-              <w:spacing w:after="0" w:line="200"/>
+              <w:spacing w:after="0" w:line="200" w:lineRule="auto"/>
             </w:pPr>
             <w:r>
               <w:rPr>
@@ -19363,7 +19380,7 @@
           </w:p>
           <w:p>
             <w:pPr>
-              <w:spacing w:after="0" w:line="200"/>
+              <w:spacing w:after="0" w:line="200" w:lineRule="auto"/>
             </w:pPr>
             <w:r>
               <w:rPr>
@@ -19376,7 +19393,7 @@
           </w:p>
           <w:p>
             <w:pPr>
-              <w:spacing w:after="0" w:line="200"/>
+              <w:spacing w:after="0" w:line="200" w:lineRule="auto"/>
             </w:pPr>
             <w:r>
               <w:rPr>
@@ -19389,7 +19406,7 @@
           </w:p>
           <w:p>
             <w:pPr>
-              <w:spacing w:after="0" w:line="200"/>
+              <w:spacing w:after="0" w:line="200" w:lineRule="auto"/>
             </w:pPr>
             <w:r>
               <w:rPr>
@@ -19402,7 +19419,7 @@
           </w:p>
           <w:p>
             <w:pPr>
-              <w:spacing w:after="0" w:line="200"/>
+              <w:spacing w:after="0" w:line="200" w:lineRule="auto"/>
             </w:pPr>
             <w:r>
               <w:rPr>
@@ -19415,7 +19432,7 @@
           </w:p>
           <w:p>
             <w:pPr>
-              <w:spacing w:after="0" w:line="200"/>
+              <w:spacing w:after="0" w:line="200" w:lineRule="auto"/>
             </w:pPr>
             <w:r>
               <w:rPr>
@@ -19428,7 +19445,7 @@
           </w:p>
           <w:p>
             <w:pPr>
-              <w:spacing w:after="0" w:line="200"/>
+              <w:spacing w:after="0" w:line="200" w:lineRule="auto"/>
             </w:pPr>
             <w:r>
               <w:rPr>
@@ -19441,7 +19458,7 @@
           </w:p>
           <w:p>
             <w:pPr>
-              <w:spacing w:after="0" w:line="200"/>
+              <w:spacing w:after="0" w:line="200" w:lineRule="auto"/>
             </w:pPr>
             <w:r>
               <w:rPr>
@@ -19454,7 +19471,7 @@
           </w:p>
           <w:p>
             <w:pPr>
-              <w:spacing w:after="0" w:line="200"/>
+              <w:spacing w:after="0" w:line="200" w:lineRule="auto"/>
             </w:pPr>
             <w:r>
               <w:rPr>
@@ -19467,7 +19484,7 @@
           </w:p>
           <w:p>
             <w:pPr>
-              <w:spacing w:after="0" w:line="200"/>
+              <w:spacing w:after="0" w:line="200" w:lineRule="auto"/>
             </w:pPr>
             <w:r>
               <w:rPr>
@@ -19480,7 +19497,7 @@
           </w:p>
           <w:p>
             <w:pPr>
-              <w:spacing w:after="0" w:line="200"/>
+              <w:spacing w:after="0" w:line="200" w:lineRule="auto"/>
             </w:pPr>
             <w:r>
               <w:rPr>
@@ -19493,7 +19510,7 @@
           </w:p>
           <w:p>
             <w:pPr>
-              <w:spacing w:after="0" w:line="200"/>
+              <w:spacing w:after="0" w:line="200" w:lineRule="auto"/>
             </w:pPr>
             <w:r>
               <w:rPr>
@@ -19506,7 +19523,7 @@
           </w:p>
           <w:p>
             <w:pPr>
-              <w:spacing w:after="0" w:line="200"/>
+              <w:spacing w:after="0" w:line="200" w:lineRule="auto"/>
             </w:pPr>
             <w:r>
               <w:rPr>
@@ -19519,7 +19536,7 @@
           </w:p>
           <w:p>
             <w:pPr>
-              <w:spacing w:after="0" w:line="200"/>
+              <w:spacing w:after="0" w:line="200" w:lineRule="auto"/>
             </w:pPr>
             <w:r>
               <w:rPr>
@@ -19555,7 +19572,7 @@
     </w:p>
     <w:tbl>
       <w:tblPr>
-        <w:tblW w:type="pct" w:w="100%"/>
+        <w:tblW w:type="dxa" w:w="9350"/>
         <w:tblBorders>
           <w:top w:val="single" w:color="BFBFBF" w:sz="4"/>
           <w:left w:val="single" w:color="BFBFBF" w:sz="4"/>
@@ -19566,11 +19583,12 @@
         </w:tblBorders>
       </w:tblPr>
       <w:tblGrid>
-        <w:gridCol w:w="100"/>
+        <w:gridCol w:w="9350"/>
       </w:tblGrid>
       <w:tr>
         <w:tc>
           <w:tcPr>
+            <w:tcW w:type="dxa" w:w="9350"/>
             <w:shd w:fill="F7F7F7" w:val="clear"/>
             <w:tcMar>
               <w:top w:type="dxa" w:w="100"/>
@@ -19581,7 +19599,7 @@
           </w:tcPr>
           <w:p>
             <w:pPr>
-              <w:spacing w:after="0" w:line="200"/>
+              <w:spacing w:after="0" w:line="200" w:lineRule="auto"/>
             </w:pPr>
             <w:r>
               <w:rPr>
@@ -19594,7 +19612,7 @@
           </w:p>
           <w:p>
             <w:pPr>
-              <w:spacing w:after="0" w:line="200"/>
+              <w:spacing w:after="0" w:line="200" w:lineRule="auto"/>
             </w:pPr>
             <w:r>
               <w:rPr>
@@ -19607,7 +19625,7 @@
           </w:p>
           <w:p>
             <w:pPr>
-              <w:spacing w:after="0" w:line="200"/>
+              <w:spacing w:after="0" w:line="200" w:lineRule="auto"/>
             </w:pPr>
             <w:r>
               <w:rPr>
@@ -19620,7 +19638,7 @@
           </w:p>
           <w:p>
             <w:pPr>
-              <w:spacing w:after="0" w:line="200"/>
+              <w:spacing w:after="0" w:line="200" w:lineRule="auto"/>
             </w:pPr>
             <w:r>
               <w:rPr>
@@ -19633,7 +19651,7 @@
           </w:p>
           <w:p>
             <w:pPr>
-              <w:spacing w:after="0" w:line="200"/>
+              <w:spacing w:after="0" w:line="200" w:lineRule="auto"/>
             </w:pPr>
             <w:r>
               <w:rPr>
@@ -19646,7 +19664,7 @@
           </w:p>
           <w:p>
             <w:pPr>
-              <w:spacing w:after="0" w:line="200"/>
+              <w:spacing w:after="0" w:line="200" w:lineRule="auto"/>
             </w:pPr>
             <w:r>
               <w:rPr>
@@ -19659,7 +19677,7 @@
           </w:p>
           <w:p>
             <w:pPr>
-              <w:spacing w:after="0" w:line="200"/>
+              <w:spacing w:after="0" w:line="200" w:lineRule="auto"/>
             </w:pPr>
             <w:r>
               <w:rPr>
@@ -19672,7 +19690,7 @@
           </w:p>
           <w:p>
             <w:pPr>
-              <w:spacing w:after="0" w:line="200"/>
+              <w:spacing w:after="0" w:line="200" w:lineRule="auto"/>
             </w:pPr>
             <w:r>
               <w:rPr>
@@ -19685,7 +19703,7 @@
           </w:p>
           <w:p>
             <w:pPr>
-              <w:spacing w:after="0" w:line="200"/>
+              <w:spacing w:after="0" w:line="200" w:lineRule="auto"/>
             </w:pPr>
             <w:r>
               <w:rPr>
@@ -19698,7 +19716,7 @@
           </w:p>
           <w:p>
             <w:pPr>
-              <w:spacing w:after="0" w:line="200"/>
+              <w:spacing w:after="0" w:line="200" w:lineRule="auto"/>
             </w:pPr>
             <w:r>
               <w:rPr>
@@ -19711,7 +19729,7 @@
           </w:p>
           <w:p>
             <w:pPr>
-              <w:spacing w:after="0" w:line="200"/>
+              <w:spacing w:after="0" w:line="200" w:lineRule="auto"/>
             </w:pPr>
             <w:r>
               <w:rPr>
@@ -19724,7 +19742,7 @@
           </w:p>
           <w:p>
             <w:pPr>
-              <w:spacing w:after="0" w:line="200"/>
+              <w:spacing w:after="0" w:line="200" w:lineRule="auto"/>
             </w:pPr>
             <w:r>
               <w:rPr>
@@ -19737,7 +19755,7 @@
           </w:p>
           <w:p>
             <w:pPr>
-              <w:spacing w:after="0" w:line="200"/>
+              <w:spacing w:after="0" w:line="200" w:lineRule="auto"/>
             </w:pPr>
             <w:r>
               <w:rPr>
@@ -19750,7 +19768,7 @@
           </w:p>
           <w:p>
             <w:pPr>
-              <w:spacing w:after="0" w:line="200"/>
+              <w:spacing w:after="0" w:line="200" w:lineRule="auto"/>
             </w:pPr>
             <w:r>
               <w:rPr>
@@ -19763,7 +19781,7 @@
           </w:p>
           <w:p>
             <w:pPr>
-              <w:spacing w:after="0" w:line="200"/>
+              <w:spacing w:after="0" w:line="200" w:lineRule="auto"/>
             </w:pPr>
             <w:r>
               <w:rPr>
@@ -19776,7 +19794,7 @@
           </w:p>
           <w:p>
             <w:pPr>
-              <w:spacing w:after="0" w:line="200"/>
+              <w:spacing w:after="0" w:line="200" w:lineRule="auto"/>
             </w:pPr>
             <w:r>
               <w:rPr>
@@ -19789,7 +19807,7 @@
           </w:p>
           <w:p>
             <w:pPr>
-              <w:spacing w:after="0" w:line="200"/>
+              <w:spacing w:after="0" w:line="200" w:lineRule="auto"/>
             </w:pPr>
             <w:r>
               <w:rPr>
@@ -19802,7 +19820,7 @@
           </w:p>
           <w:p>
             <w:pPr>
-              <w:spacing w:after="0" w:line="200"/>
+              <w:spacing w:after="0" w:line="200" w:lineRule="auto"/>
             </w:pPr>
             <w:r>
               <w:rPr>
@@ -19815,7 +19833,7 @@
           </w:p>
           <w:p>
             <w:pPr>
-              <w:spacing w:after="0" w:line="200"/>
+              <w:spacing w:after="0" w:line="200" w:lineRule="auto"/>
             </w:pPr>
             <w:r>
               <w:rPr>
@@ -19828,7 +19846,7 @@
           </w:p>
           <w:p>
             <w:pPr>
-              <w:spacing w:after="0" w:line="200"/>
+              <w:spacing w:after="0" w:line="200" w:lineRule="auto"/>
             </w:pPr>
             <w:r>
               <w:rPr>
@@ -19841,7 +19859,7 @@
           </w:p>
           <w:p>
             <w:pPr>
-              <w:spacing w:after="0" w:line="200"/>
+              <w:spacing w:after="0" w:line="200" w:lineRule="auto"/>
             </w:pPr>
             <w:r>
               <w:rPr>
@@ -19854,7 +19872,7 @@
           </w:p>
           <w:p>
             <w:pPr>
-              <w:spacing w:after="0" w:line="200"/>
+              <w:spacing w:after="0" w:line="200" w:lineRule="auto"/>
             </w:pPr>
             <w:r>
               <w:rPr>
@@ -19867,7 +19885,7 @@
           </w:p>
           <w:p>
             <w:pPr>
-              <w:spacing w:after="0" w:line="200"/>
+              <w:spacing w:after="0" w:line="200" w:lineRule="auto"/>
             </w:pPr>
             <w:r>
               <w:rPr>
@@ -19880,7 +19898,7 @@
           </w:p>
           <w:p>
             <w:pPr>
-              <w:spacing w:after="0" w:line="200"/>
+              <w:spacing w:after="0" w:line="200" w:lineRule="auto"/>
             </w:pPr>
             <w:r>
               <w:rPr>
@@ -19893,7 +19911,7 @@
           </w:p>
           <w:p>
             <w:pPr>
-              <w:spacing w:after="0" w:line="200"/>
+              <w:spacing w:after="0" w:line="200" w:lineRule="auto"/>
             </w:pPr>
             <w:r>
               <w:rPr>
@@ -19906,7 +19924,7 @@
           </w:p>
           <w:p>
             <w:pPr>
-              <w:spacing w:after="0" w:line="200"/>
+              <w:spacing w:after="0" w:line="200" w:lineRule="auto"/>
             </w:pPr>
             <w:r>
               <w:rPr>
@@ -19942,7 +19960,7 @@
     </w:p>
     <w:tbl>
       <w:tblPr>
-        <w:tblW w:type="pct" w:w="100%"/>
+        <w:tblW w:type="dxa" w:w="9350"/>
         <w:tblBorders>
           <w:top w:val="single" w:color="BFBFBF" w:sz="4"/>
           <w:left w:val="single" w:color="BFBFBF" w:sz="4"/>
@@ -19953,11 +19971,12 @@
         </w:tblBorders>
       </w:tblPr>
       <w:tblGrid>
-        <w:gridCol w:w="100"/>
+        <w:gridCol w:w="9350"/>
       </w:tblGrid>
       <w:tr>
         <w:tc>
           <w:tcPr>
+            <w:tcW w:type="dxa" w:w="9350"/>
             <w:shd w:fill="F7F7F7" w:val="clear"/>
             <w:tcMar>
               <w:top w:type="dxa" w:w="100"/>
@@ -19968,7 +19987,7 @@
           </w:tcPr>
           <w:p>
             <w:pPr>
-              <w:spacing w:after="0" w:line="200"/>
+              <w:spacing w:after="0" w:line="200" w:lineRule="auto"/>
             </w:pPr>
             <w:r>
               <w:rPr>
@@ -19981,7 +20000,7 @@
           </w:p>
           <w:p>
             <w:pPr>
-              <w:spacing w:after="0" w:line="200"/>
+              <w:spacing w:after="0" w:line="200" w:lineRule="auto"/>
             </w:pPr>
             <w:r>
               <w:rPr>
@@ -19994,7 +20013,7 @@
           </w:p>
           <w:p>
             <w:pPr>
-              <w:spacing w:after="0" w:line="200"/>
+              <w:spacing w:after="0" w:line="200" w:lineRule="auto"/>
             </w:pPr>
             <w:r>
               <w:rPr>
@@ -20007,7 +20026,7 @@
           </w:p>
           <w:p>
             <w:pPr>
-              <w:spacing w:after="0" w:line="200"/>
+              <w:spacing w:after="0" w:line="200" w:lineRule="auto"/>
             </w:pPr>
             <w:r>
               <w:rPr>
@@ -20020,7 +20039,7 @@
           </w:p>
           <w:p>
             <w:pPr>
-              <w:spacing w:after="0" w:line="200"/>
+              <w:spacing w:after="0" w:line="200" w:lineRule="auto"/>
             </w:pPr>
             <w:r>
               <w:rPr>
@@ -20033,7 +20052,7 @@
           </w:p>
           <w:p>
             <w:pPr>
-              <w:spacing w:after="0" w:line="200"/>
+              <w:spacing w:after="0" w:line="200" w:lineRule="auto"/>
             </w:pPr>
             <w:r>
               <w:rPr>
@@ -20046,7 +20065,7 @@
           </w:p>
           <w:p>
             <w:pPr>
-              <w:spacing w:after="0" w:line="200"/>
+              <w:spacing w:after="0" w:line="200" w:lineRule="auto"/>
             </w:pPr>
             <w:r>
               <w:rPr>
@@ -20059,7 +20078,7 @@
           </w:p>
           <w:p>
             <w:pPr>
-              <w:spacing w:after="0" w:line="200"/>
+              <w:spacing w:after="0" w:line="200" w:lineRule="auto"/>
             </w:pPr>
             <w:r>
               <w:rPr>
@@ -20072,7 +20091,7 @@
           </w:p>
           <w:p>
             <w:pPr>
-              <w:spacing w:after="0" w:line="200"/>
+              <w:spacing w:after="0" w:line="200" w:lineRule="auto"/>
             </w:pPr>
             <w:r>
               <w:rPr>
@@ -20085,7 +20104,7 @@
           </w:p>
           <w:p>
             <w:pPr>
-              <w:spacing w:after="0" w:line="200"/>
+              <w:spacing w:after="0" w:line="200" w:lineRule="auto"/>
             </w:pPr>
             <w:r>
               <w:rPr>
@@ -20098,7 +20117,7 @@
           </w:p>
           <w:p>
             <w:pPr>
-              <w:spacing w:after="0" w:line="200"/>
+              <w:spacing w:after="0" w:line="200" w:lineRule="auto"/>
             </w:pPr>
             <w:r>
               <w:rPr>
@@ -20111,7 +20130,7 @@
           </w:p>
           <w:p>
             <w:pPr>
-              <w:spacing w:after="0" w:line="200"/>
+              <w:spacing w:after="0" w:line="200" w:lineRule="auto"/>
             </w:pPr>
             <w:r>
               <w:rPr>
@@ -20124,7 +20143,7 @@
           </w:p>
           <w:p>
             <w:pPr>
-              <w:spacing w:after="0" w:line="200"/>
+              <w:spacing w:after="0" w:line="200" w:lineRule="auto"/>
             </w:pPr>
             <w:r>
               <w:rPr>
@@ -20137,7 +20156,7 @@
           </w:p>
           <w:p>
             <w:pPr>
-              <w:spacing w:after="0" w:line="200"/>
+              <w:spacing w:after="0" w:line="200" w:lineRule="auto"/>
             </w:pPr>
             <w:r>
               <w:rPr>
@@ -20150,7 +20169,7 @@
           </w:p>
           <w:p>
             <w:pPr>
-              <w:spacing w:after="0" w:line="200"/>
+              <w:spacing w:after="0" w:line="200" w:lineRule="auto"/>
             </w:pPr>
             <w:r>
               <w:rPr>
@@ -20163,7 +20182,7 @@
           </w:p>
           <w:p>
             <w:pPr>
-              <w:spacing w:after="0" w:line="200"/>
+              <w:spacing w:after="0" w:line="200" w:lineRule="auto"/>
             </w:pPr>
             <w:r>
               <w:rPr>
@@ -20176,7 +20195,7 @@
           </w:p>
           <w:p>
             <w:pPr>
-              <w:spacing w:after="0" w:line="200"/>
+              <w:spacing w:after="0" w:line="200" w:lineRule="auto"/>
             </w:pPr>
             <w:r>
               <w:rPr>
@@ -20189,7 +20208,7 @@
           </w:p>
           <w:p>
             <w:pPr>
-              <w:spacing w:after="0" w:line="200"/>
+              <w:spacing w:after="0" w:line="200" w:lineRule="auto"/>
             </w:pPr>
             <w:r>
               <w:rPr>
@@ -20261,7 +20280,7 @@
     </w:p>
     <w:tbl>
       <w:tblPr>
-        <w:tblW w:type="pct" w:w="100%"/>
+        <w:tblW w:type="dxa" w:w="9350"/>
         <w:tblBorders>
           <w:top w:val="single" w:color="BFBFBF" w:sz="4"/>
           <w:left w:val="single" w:color="BFBFBF" w:sz="4"/>
@@ -20272,11 +20291,12 @@
         </w:tblBorders>
       </w:tblPr>
       <w:tblGrid>
-        <w:gridCol w:w="100"/>
+        <w:gridCol w:w="9350"/>
       </w:tblGrid>
       <w:tr>
         <w:tc>
           <w:tcPr>
+            <w:tcW w:type="dxa" w:w="9350"/>
             <w:shd w:fill="F7F7F7" w:val="clear"/>
             <w:tcMar>
               <w:top w:type="dxa" w:w="100"/>
@@ -20287,7 +20307,7 @@
           </w:tcPr>
           <w:p>
             <w:pPr>
-              <w:spacing w:after="0" w:line="200"/>
+              <w:spacing w:after="0" w:line="200" w:lineRule="auto"/>
             </w:pPr>
             <w:r>
               <w:rPr>
@@ -20322,7 +20342,7 @@
     </w:p>
     <w:tbl>
       <w:tblPr>
-        <w:tblW w:type="pct" w:w="100%"/>
+        <w:tblW w:type="dxa" w:w="9350"/>
         <w:tblBorders>
           <w:top w:val="single" w:color="BFBFBF" w:sz="4"/>
           <w:left w:val="single" w:color="BFBFBF" w:sz="4"/>
@@ -20333,11 +20353,12 @@
         </w:tblBorders>
       </w:tblPr>
       <w:tblGrid>
-        <w:gridCol w:w="100"/>
+        <w:gridCol w:w="9350"/>
       </w:tblGrid>
       <w:tr>
         <w:tc>
           <w:tcPr>
+            <w:tcW w:type="dxa" w:w="9350"/>
             <w:shd w:fill="F7F7F7" w:val="clear"/>
             <w:tcMar>
               <w:top w:type="dxa" w:w="100"/>
@@ -20348,7 +20369,7 @@
           </w:tcPr>
           <w:p>
             <w:pPr>
-              <w:spacing w:after="0" w:line="200"/>
+              <w:spacing w:after="0" w:line="200" w:lineRule="auto"/>
             </w:pPr>
             <w:r>
               <w:rPr>
@@ -20383,7 +20404,7 @@
     </w:p>
     <w:tbl>
       <w:tblPr>
-        <w:tblW w:type="pct" w:w="100%"/>
+        <w:tblW w:type="dxa" w:w="9350"/>
         <w:tblBorders>
           <w:top w:val="single" w:color="BFBFBF" w:sz="4"/>
           <w:left w:val="single" w:color="BFBFBF" w:sz="4"/>
@@ -20394,11 +20415,12 @@
         </w:tblBorders>
       </w:tblPr>
       <w:tblGrid>
-        <w:gridCol w:w="100"/>
+        <w:gridCol w:w="9350"/>
       </w:tblGrid>
       <w:tr>
         <w:tc>
           <w:tcPr>
+            <w:tcW w:type="dxa" w:w="9350"/>
             <w:shd w:fill="F7F7F7" w:val="clear"/>
             <w:tcMar>
               <w:top w:type="dxa" w:w="100"/>
@@ -20409,7 +20431,7 @@
           </w:tcPr>
           <w:p>
             <w:pPr>
-              <w:spacing w:after="0" w:line="200"/>
+              <w:spacing w:after="0" w:line="200" w:lineRule="auto"/>
             </w:pPr>
             <w:r>
               <w:rPr>
@@ -20444,7 +20466,7 @@
     </w:p>
     <w:tbl>
       <w:tblPr>
-        <w:tblW w:type="pct" w:w="100%"/>
+        <w:tblW w:type="dxa" w:w="9350"/>
         <w:tblBorders>
           <w:top w:val="single" w:color="BFBFBF" w:sz="4"/>
           <w:left w:val="single" w:color="BFBFBF" w:sz="4"/>
@@ -20455,11 +20477,12 @@
         </w:tblBorders>
       </w:tblPr>
       <w:tblGrid>
-        <w:gridCol w:w="100"/>
+        <w:gridCol w:w="9350"/>
       </w:tblGrid>
       <w:tr>
         <w:tc>
           <w:tcPr>
+            <w:tcW w:type="dxa" w:w="9350"/>
             <w:shd w:fill="F7F7F7" w:val="clear"/>
             <w:tcMar>
               <w:top w:type="dxa" w:w="100"/>
@@ -20470,7 +20493,7 @@
           </w:tcPr>
           <w:p>
             <w:pPr>
-              <w:spacing w:after="0" w:line="200"/>
+              <w:spacing w:after="0" w:line="200" w:lineRule="auto"/>
             </w:pPr>
             <w:r>
               <w:rPr>
@@ -20505,7 +20528,7 @@
     </w:p>
     <w:tbl>
       <w:tblPr>
-        <w:tblW w:type="pct" w:w="100%"/>
+        <w:tblW w:type="dxa" w:w="9350"/>
         <w:tblBorders>
           <w:top w:val="single" w:color="BFBFBF" w:sz="4"/>
           <w:left w:val="single" w:color="BFBFBF" w:sz="4"/>
@@ -20516,11 +20539,12 @@
         </w:tblBorders>
       </w:tblPr>
       <w:tblGrid>
-        <w:gridCol w:w="100"/>
+        <w:gridCol w:w="9350"/>
       </w:tblGrid>
       <w:tr>
         <w:tc>
           <w:tcPr>
+            <w:tcW w:type="dxa" w:w="9350"/>
             <w:shd w:fill="F7F7F7" w:val="clear"/>
             <w:tcMar>
               <w:top w:type="dxa" w:w="100"/>
@@ -20531,7 +20555,7 @@
           </w:tcPr>
           <w:p>
             <w:pPr>
-              <w:spacing w:after="0" w:line="200"/>
+              <w:spacing w:after="0" w:line="200" w:lineRule="auto"/>
             </w:pPr>
             <w:r>
               <w:rPr>
@@ -20544,7 +20568,7 @@
           </w:p>
           <w:p>
             <w:pPr>
-              <w:spacing w:after="0" w:line="200"/>
+              <w:spacing w:after="0" w:line="200" w:lineRule="auto"/>
             </w:pPr>
             <w:r>
               <w:rPr>
@@ -20593,7 +20617,7 @@
     </w:p>
     <w:tbl>
       <w:tblPr>
-        <w:tblW w:type="pct" w:w="100%"/>
+        <w:tblW w:type="dxa" w:w="9350"/>
         <w:tblBorders>
           <w:top w:val="single" w:color="BFBFBF" w:sz="4"/>
           <w:left w:val="single" w:color="BFBFBF" w:sz="4"/>
@@ -20604,11 +20628,12 @@
         </w:tblBorders>
       </w:tblPr>
       <w:tblGrid>
-        <w:gridCol w:w="100"/>
+        <w:gridCol w:w="9350"/>
       </w:tblGrid>
       <w:tr>
         <w:tc>
           <w:tcPr>
+            <w:tcW w:type="dxa" w:w="9350"/>
             <w:shd w:fill="F7F7F7" w:val="clear"/>
             <w:tcMar>
               <w:top w:type="dxa" w:w="100"/>
@@ -20619,7 +20644,7 @@
           </w:tcPr>
           <w:p>
             <w:pPr>
-              <w:spacing w:after="0" w:line="200"/>
+              <w:spacing w:after="0" w:line="200" w:lineRule="auto"/>
             </w:pPr>
             <w:r>
               <w:rPr>
@@ -20686,7 +20711,7 @@
     </w:p>
     <w:tbl>
       <w:tblPr>
-        <w:tblW w:type="pct" w:w="100%"/>
+        <w:tblW w:type="dxa" w:w="9350"/>
         <w:tblBorders>
           <w:top w:val="single" w:color="BFBFBF" w:sz="4"/>
           <w:left w:val="single" w:color="BFBFBF" w:sz="4"/>
@@ -20697,11 +20722,12 @@
         </w:tblBorders>
       </w:tblPr>
       <w:tblGrid>
-        <w:gridCol w:w="100"/>
+        <w:gridCol w:w="9350"/>
       </w:tblGrid>
       <w:tr>
         <w:tc>
           <w:tcPr>
+            <w:tcW w:type="dxa" w:w="9350"/>
             <w:shd w:fill="F7F7F7" w:val="clear"/>
             <w:tcMar>
               <w:top w:type="dxa" w:w="100"/>
@@ -20712,7 +20738,7 @@
           </w:tcPr>
           <w:p>
             <w:pPr>
-              <w:spacing w:after="0" w:line="200"/>
+              <w:spacing w:after="0" w:line="200" w:lineRule="auto"/>
             </w:pPr>
             <w:r>
               <w:rPr>
@@ -20725,7 +20751,7 @@
           </w:p>
           <w:p>
             <w:pPr>
-              <w:spacing w:after="0" w:line="200"/>
+              <w:spacing w:after="0" w:line="200" w:lineRule="auto"/>
             </w:pPr>
             <w:r>
               <w:rPr>
@@ -20760,7 +20786,7 @@
     </w:p>
     <w:tbl>
       <w:tblPr>
-        <w:tblW w:type="pct" w:w="100%"/>
+        <w:tblW w:type="dxa" w:w="9350"/>
         <w:tblBorders>
           <w:top w:val="single" w:color="BFBFBF" w:sz="4"/>
           <w:left w:val="single" w:color="BFBFBF" w:sz="4"/>
@@ -20771,11 +20797,12 @@
         </w:tblBorders>
       </w:tblPr>
       <w:tblGrid>
-        <w:gridCol w:w="100"/>
+        <w:gridCol w:w="9350"/>
       </w:tblGrid>
       <w:tr>
         <w:tc>
           <w:tcPr>
+            <w:tcW w:type="dxa" w:w="9350"/>
             <w:shd w:fill="F7F7F7" w:val="clear"/>
             <w:tcMar>
               <w:top w:type="dxa" w:w="100"/>
@@ -20786,7 +20813,7 @@
           </w:tcPr>
           <w:p>
             <w:pPr>
-              <w:spacing w:after="0" w:line="200"/>
+              <w:spacing w:after="0" w:line="200" w:lineRule="auto"/>
             </w:pPr>
             <w:r>
               <w:rPr>
@@ -20799,7 +20826,7 @@
           </w:p>
           <w:p>
             <w:pPr>
-              <w:spacing w:after="0" w:line="200"/>
+              <w:spacing w:after="0" w:line="200" w:lineRule="auto"/>
             </w:pPr>
             <w:r>
               <w:rPr>
@@ -20812,7 +20839,7 @@
           </w:p>
           <w:p>
             <w:pPr>
-              <w:spacing w:after="0" w:line="200"/>
+              <w:spacing w:after="0" w:line="200" w:lineRule="auto"/>
             </w:pPr>
             <w:r>
               <w:rPr>
@@ -20825,7 +20852,7 @@
           </w:p>
           <w:p>
             <w:pPr>
-              <w:spacing w:after="0" w:line="200"/>
+              <w:spacing w:after="0" w:line="200" w:lineRule="auto"/>
             </w:pPr>
             <w:r>
               <w:rPr>
@@ -20860,7 +20887,7 @@
     </w:p>
     <w:tbl>
       <w:tblPr>
-        <w:tblW w:type="pct" w:w="100%"/>
+        <w:tblW w:type="dxa" w:w="9350"/>
         <w:tblBorders>
           <w:top w:val="single" w:color="BFBFBF" w:sz="4"/>
           <w:left w:val="single" w:color="BFBFBF" w:sz="4"/>
@@ -20871,11 +20898,12 @@
         </w:tblBorders>
       </w:tblPr>
       <w:tblGrid>
-        <w:gridCol w:w="100"/>
+        <w:gridCol w:w="9350"/>
       </w:tblGrid>
       <w:tr>
         <w:tc>
           <w:tcPr>
+            <w:tcW w:type="dxa" w:w="9350"/>
             <w:shd w:fill="F7F7F7" w:val="clear"/>
             <w:tcMar>
               <w:top w:type="dxa" w:w="100"/>
@@ -20886,7 +20914,7 @@
           </w:tcPr>
           <w:p>
             <w:pPr>
-              <w:spacing w:after="0" w:line="200"/>
+              <w:spacing w:after="0" w:line="200" w:lineRule="auto"/>
             </w:pPr>
             <w:r>
               <w:rPr>
@@ -20899,7 +20927,7 @@
           </w:p>
           <w:p>
             <w:pPr>
-              <w:spacing w:after="0" w:line="200"/>
+              <w:spacing w:after="0" w:line="200" w:lineRule="auto"/>
             </w:pPr>
             <w:r>
               <w:rPr>
@@ -20912,7 +20940,7 @@
           </w:p>
           <w:p>
             <w:pPr>
-              <w:spacing w:after="0" w:line="200"/>
+              <w:spacing w:after="0" w:line="200" w:lineRule="auto"/>
             </w:pPr>
             <w:r>
               <w:rPr>
@@ -21056,7 +21084,7 @@
     </w:p>
     <w:tbl>
       <w:tblPr>
-        <w:tblW w:type="pct" w:w="100%"/>
+        <w:tblW w:type="dxa" w:w="9350"/>
         <w:tblBorders>
           <w:top w:val="single" w:color="BFBFBF" w:sz="4"/>
           <w:left w:val="single" w:color="BFBFBF" w:sz="4"/>
@@ -21067,11 +21095,12 @@
         </w:tblBorders>
       </w:tblPr>
       <w:tblGrid>
-        <w:gridCol w:w="100"/>
+        <w:gridCol w:w="9350"/>
       </w:tblGrid>
       <w:tr>
         <w:tc>
           <w:tcPr>
+            <w:tcW w:type="dxa" w:w="9350"/>
             <w:shd w:fill="F7F7F7" w:val="clear"/>
             <w:tcMar>
               <w:top w:type="dxa" w:w="100"/>
@@ -21082,7 +21111,7 @@
           </w:tcPr>
           <w:p>
             <w:pPr>
-              <w:spacing w:after="0" w:line="200"/>
+              <w:spacing w:after="0" w:line="200" w:lineRule="auto"/>
             </w:pPr>
             <w:r>
               <w:rPr>
@@ -21095,7 +21124,7 @@
           </w:p>
           <w:p>
             <w:pPr>
-              <w:spacing w:after="0" w:line="200"/>
+              <w:spacing w:after="0" w:line="200" w:lineRule="auto"/>
             </w:pPr>
             <w:r>
               <w:rPr>
@@ -21108,7 +21137,7 @@
           </w:p>
           <w:p>
             <w:pPr>
-              <w:spacing w:after="0" w:line="200"/>
+              <w:spacing w:after="0" w:line="200" w:lineRule="auto"/>
             </w:pPr>
             <w:r>
               <w:rPr>
@@ -21121,7 +21150,7 @@
           </w:p>
           <w:p>
             <w:pPr>
-              <w:spacing w:after="0" w:line="200"/>
+              <w:spacing w:after="0" w:line="200" w:lineRule="auto"/>
             </w:pPr>
             <w:r>
               <w:rPr>

</xml_diff>